<commit_message>
feat(auth): role-based post-login redirect (admin -> /admin, user -> /dashboard)
- add landingPath/landingPathForRoles helpers in lib/auth
- LoginPage navigates by role on success
- unit tests for both branches + default
- document landing in auth-flow, auth-screens, routing-auth, frontend-architecture, 01-auth
</commit_message>
<xml_diff>
--- a/WorldCup2026 BusinessLogic EN.docx
+++ b/WorldCup2026 BusinessLogic EN.docx
@@ -2918,24 +2918,6 @@
           <w:szCs w:val="22"/>
         </w:rPr>
         <w:t xml:space="preserve">Fills in the predicted score (goals for Team A and Team B).</w:t>
-      </w:r>
-    </w:p>
-    <w:p>
-      <w:pPr>
-        <w:pStyle w:val="ListParagraph"/>
-        <w:numPr>
-          <w:ilvl w:val="0"/>
-          <w:numId w:val="3"/>
-        </w:numPr>
-        <w:spacing w:after="60" w:before="60"/>
-      </w:pPr>
-      <w:r>
-        <w:rPr>
-          <w:rFonts w:ascii="Arial" w:cs="Arial" w:eastAsia="Arial" w:hAnsi="Arial"/>
-          <w:sz w:val="22"/>
-          <w:szCs w:val="22"/>
-        </w:rPr>
-        <w:t xml:space="preserve">Optionally fills in bonus predictions: first goalscorer, team to kick off, yellow cards total, red cards total, minute of first goal, penalty during match (yes/no), substitutions per team.</w:t>
       </w:r>
     </w:p>
     <w:p>
@@ -4761,1800 +4743,6 @@
           </w:p>
         </w:tc>
       </w:tr>
-      <w:tr>
-        <w:tc>
-          <w:tcPr>
-            <w:tcW w:type="dxa" w:w="3000"/>
-            <w:tcBorders>
-              <w:top w:val="single" w:color="AAAAAA" w:sz="1"/>
-              <w:left w:val="single" w:color="AAAAAA" w:sz="1"/>
-              <w:bottom w:val="single" w:color="AAAAAA" w:sz="1"/>
-              <w:right w:val="single" w:color="AAAAAA" w:sz="1"/>
-            </w:tcBorders>
-            <w:shd w:fill="FFFFFF" w:val="clear"/>
-            <w:tcMar>
-              <w:top w:type="dxa" w:w="80"/>
-              <w:left w:type="dxa" w:w="120"/>
-              <w:bottom w:type="dxa" w:w="80"/>
-              <w:right w:type="dxa" w:w="120"/>
-            </w:tcMar>
-          </w:tcPr>
-          <w:p>
-            <w:pPr>
-              <w:jc w:val="left"/>
-            </w:pPr>
-            <w:r>
-              <w:rPr>
-                <w:rFonts w:ascii="Arial" w:cs="Arial" w:eastAsia="Arial" w:hAnsi="Arial"/>
-                <w:b w:val="false"/>
-                <w:bCs w:val="false"/>
-                <w:color w:val="000000"/>
-                <w:sz w:val="20"/>
-                <w:szCs w:val="20"/>
-              </w:rPr>
-              <w:t xml:space="preserve">Bonus: exact goal difference</w:t>
-            </w:r>
-          </w:p>
-        </w:tc>
-        <w:tc>
-          <w:tcPr>
-            <w:tcW w:type="dxa" w:w="2000"/>
-            <w:tcBorders>
-              <w:top w:val="single" w:color="AAAAAA" w:sz="1"/>
-              <w:left w:val="single" w:color="AAAAAA" w:sz="1"/>
-              <w:bottom w:val="single" w:color="AAAAAA" w:sz="1"/>
-              <w:right w:val="single" w:color="AAAAAA" w:sz="1"/>
-            </w:tcBorders>
-            <w:shd w:fill="FFFFFF" w:val="clear"/>
-            <w:tcMar>
-              <w:top w:type="dxa" w:w="80"/>
-              <w:left w:type="dxa" w:w="120"/>
-              <w:bottom w:type="dxa" w:w="80"/>
-              <w:right w:type="dxa" w:w="120"/>
-            </w:tcMar>
-          </w:tcPr>
-          <w:p>
-            <w:pPr>
-              <w:jc w:val="left"/>
-            </w:pPr>
-            <w:r>
-              <w:rPr>
-                <w:rFonts w:ascii="Arial" w:cs="Arial" w:eastAsia="Arial" w:hAnsi="Arial"/>
-                <w:b w:val="false"/>
-                <w:bCs w:val="false"/>
-                <w:color w:val="000000"/>
-                <w:sz w:val="20"/>
-                <w:szCs w:val="20"/>
-              </w:rPr>
-              <w:t xml:space="preserve">1 point</w:t>
-            </w:r>
-          </w:p>
-        </w:tc>
-        <w:tc>
-          <w:tcPr>
-            <w:tcW w:type="dxa" w:w="1400"/>
-            <w:tcBorders>
-              <w:top w:val="single" w:color="AAAAAA" w:sz="1"/>
-              <w:left w:val="single" w:color="AAAAAA" w:sz="1"/>
-              <w:bottom w:val="single" w:color="AAAAAA" w:sz="1"/>
-              <w:right w:val="single" w:color="AAAAAA" w:sz="1"/>
-            </w:tcBorders>
-            <w:shd w:fill="FFFFFF" w:val="clear"/>
-            <w:tcMar>
-              <w:top w:type="dxa" w:w="80"/>
-              <w:left w:type="dxa" w:w="120"/>
-              <w:bottom w:type="dxa" w:w="80"/>
-              <w:right w:type="dxa" w:w="120"/>
-            </w:tcMar>
-          </w:tcPr>
-          <w:p>
-            <w:pPr>
-              <w:jc w:val="left"/>
-            </w:pPr>
-            <w:r>
-              <w:rPr>
-                <w:rFonts w:ascii="Arial" w:cs="Arial" w:eastAsia="Arial" w:hAnsi="Arial"/>
-                <w:b w:val="false"/>
-                <w:bCs w:val="false"/>
-                <w:color w:val="000000"/>
-                <w:sz w:val="20"/>
-                <w:szCs w:val="20"/>
-              </w:rPr>
-              <w:t xml:space="preserve">0</w:t>
-            </w:r>
-          </w:p>
-        </w:tc>
-        <w:tc>
-          <w:tcPr>
-            <w:tcW w:type="dxa" w:w="1400"/>
-            <w:tcBorders>
-              <w:top w:val="single" w:color="AAAAAA" w:sz="1"/>
-              <w:left w:val="single" w:color="AAAAAA" w:sz="1"/>
-              <w:bottom w:val="single" w:color="AAAAAA" w:sz="1"/>
-              <w:right w:val="single" w:color="AAAAAA" w:sz="1"/>
-            </w:tcBorders>
-            <w:shd w:fill="FFFFFF" w:val="clear"/>
-            <w:tcMar>
-              <w:top w:type="dxa" w:w="80"/>
-              <w:left w:type="dxa" w:w="120"/>
-              <w:bottom w:type="dxa" w:w="80"/>
-              <w:right w:type="dxa" w:w="120"/>
-            </w:tcMar>
-          </w:tcPr>
-          <w:p>
-            <w:pPr>
-              <w:jc w:val="left"/>
-            </w:pPr>
-            <w:r>
-              <w:rPr>
-                <w:rFonts w:ascii="Arial" w:cs="Arial" w:eastAsia="Arial" w:hAnsi="Arial"/>
-                <w:b w:val="false"/>
-                <w:bCs w:val="false"/>
-                <w:color w:val="000000"/>
-                <w:sz w:val="20"/>
-                <w:szCs w:val="20"/>
-              </w:rPr>
-              <w:t xml:space="preserve">3</w:t>
-            </w:r>
-          </w:p>
-        </w:tc>
-      </w:tr>
-      <w:tr>
-        <w:tc>
-          <w:tcPr>
-            <w:tcW w:type="dxa" w:w="3000"/>
-            <w:tcBorders>
-              <w:top w:val="single" w:color="AAAAAA" w:sz="1"/>
-              <w:left w:val="single" w:color="AAAAAA" w:sz="1"/>
-              <w:bottom w:val="single" w:color="AAAAAA" w:sz="1"/>
-              <w:right w:val="single" w:color="AAAAAA" w:sz="1"/>
-            </w:tcBorders>
-            <w:shd w:fill="F2F2F2" w:val="clear"/>
-            <w:tcMar>
-              <w:top w:type="dxa" w:w="80"/>
-              <w:left w:type="dxa" w:w="120"/>
-              <w:bottom w:type="dxa" w:w="80"/>
-              <w:right w:type="dxa" w:w="120"/>
-            </w:tcMar>
-          </w:tcPr>
-          <w:p>
-            <w:pPr>
-              <w:jc w:val="left"/>
-            </w:pPr>
-            <w:r>
-              <w:rPr>
-                <w:rFonts w:ascii="Arial" w:cs="Arial" w:eastAsia="Arial" w:hAnsi="Arial"/>
-                <w:b w:val="false"/>
-                <w:bCs w:val="false"/>
-                <w:color w:val="000000"/>
-                <w:sz w:val="20"/>
-                <w:szCs w:val="20"/>
-              </w:rPr>
-              <w:t xml:space="preserve">Bonus: correct first goalscorer</w:t>
-            </w:r>
-          </w:p>
-        </w:tc>
-        <w:tc>
-          <w:tcPr>
-            <w:tcW w:type="dxa" w:w="2000"/>
-            <w:tcBorders>
-              <w:top w:val="single" w:color="AAAAAA" w:sz="1"/>
-              <w:left w:val="single" w:color="AAAAAA" w:sz="1"/>
-              <w:bottom w:val="single" w:color="AAAAAA" w:sz="1"/>
-              <w:right w:val="single" w:color="AAAAAA" w:sz="1"/>
-            </w:tcBorders>
-            <w:shd w:fill="F2F2F2" w:val="clear"/>
-            <w:tcMar>
-              <w:top w:type="dxa" w:w="80"/>
-              <w:left w:type="dxa" w:w="120"/>
-              <w:bottom w:type="dxa" w:w="80"/>
-              <w:right w:type="dxa" w:w="120"/>
-            </w:tcMar>
-          </w:tcPr>
-          <w:p>
-            <w:pPr>
-              <w:jc w:val="left"/>
-            </w:pPr>
-            <w:r>
-              <w:rPr>
-                <w:rFonts w:ascii="Arial" w:cs="Arial" w:eastAsia="Arial" w:hAnsi="Arial"/>
-                <w:b w:val="false"/>
-                <w:bCs w:val="false"/>
-                <w:color w:val="000000"/>
-                <w:sz w:val="20"/>
-                <w:szCs w:val="20"/>
-              </w:rPr>
-              <w:t xml:space="preserve">2 points</w:t>
-            </w:r>
-          </w:p>
-        </w:tc>
-        <w:tc>
-          <w:tcPr>
-            <w:tcW w:type="dxa" w:w="1400"/>
-            <w:tcBorders>
-              <w:top w:val="single" w:color="AAAAAA" w:sz="1"/>
-              <w:left w:val="single" w:color="AAAAAA" w:sz="1"/>
-              <w:bottom w:val="single" w:color="AAAAAA" w:sz="1"/>
-              <w:right w:val="single" w:color="AAAAAA" w:sz="1"/>
-            </w:tcBorders>
-            <w:shd w:fill="F2F2F2" w:val="clear"/>
-            <w:tcMar>
-              <w:top w:type="dxa" w:w="80"/>
-              <w:left w:type="dxa" w:w="120"/>
-              <w:bottom w:type="dxa" w:w="80"/>
-              <w:right w:type="dxa" w:w="120"/>
-            </w:tcMar>
-          </w:tcPr>
-          <w:p>
-            <w:pPr>
-              <w:jc w:val="left"/>
-            </w:pPr>
-            <w:r>
-              <w:rPr>
-                <w:rFonts w:ascii="Arial" w:cs="Arial" w:eastAsia="Arial" w:hAnsi="Arial"/>
-                <w:b w:val="false"/>
-                <w:bCs w:val="false"/>
-                <w:color w:val="000000"/>
-                <w:sz w:val="20"/>
-                <w:szCs w:val="20"/>
-              </w:rPr>
-              <w:t xml:space="preserve">0</w:t>
-            </w:r>
-          </w:p>
-        </w:tc>
-        <w:tc>
-          <w:tcPr>
-            <w:tcW w:type="dxa" w:w="1400"/>
-            <w:tcBorders>
-              <w:top w:val="single" w:color="AAAAAA" w:sz="1"/>
-              <w:left w:val="single" w:color="AAAAAA" w:sz="1"/>
-              <w:bottom w:val="single" w:color="AAAAAA" w:sz="1"/>
-              <w:right w:val="single" w:color="AAAAAA" w:sz="1"/>
-            </w:tcBorders>
-            <w:shd w:fill="F2F2F2" w:val="clear"/>
-            <w:tcMar>
-              <w:top w:type="dxa" w:w="80"/>
-              <w:left w:type="dxa" w:w="120"/>
-              <w:bottom w:type="dxa" w:w="80"/>
-              <w:right w:type="dxa" w:w="120"/>
-            </w:tcMar>
-          </w:tcPr>
-          <w:p>
-            <w:pPr>
-              <w:jc w:val="left"/>
-            </w:pPr>
-            <w:r>
-              <w:rPr>
-                <w:rFonts w:ascii="Arial" w:cs="Arial" w:eastAsia="Arial" w:hAnsi="Arial"/>
-                <w:b w:val="false"/>
-                <w:bCs w:val="false"/>
-                <w:color w:val="000000"/>
-                <w:sz w:val="20"/>
-                <w:szCs w:val="20"/>
-              </w:rPr>
-              <w:t xml:space="preserve">5</w:t>
-            </w:r>
-          </w:p>
-        </w:tc>
-      </w:tr>
-      <w:tr>
-        <w:tc>
-          <w:tcPr>
-            <w:tcW w:type="dxa" w:w="3000"/>
-            <w:tcBorders>
-              <w:top w:val="single" w:color="AAAAAA" w:sz="1"/>
-              <w:left w:val="single" w:color="AAAAAA" w:sz="1"/>
-              <w:bottom w:val="single" w:color="AAAAAA" w:sz="1"/>
-              <w:right w:val="single" w:color="AAAAAA" w:sz="1"/>
-            </w:tcBorders>
-            <w:shd w:fill="FFFFFF" w:val="clear"/>
-            <w:tcMar>
-              <w:top w:type="dxa" w:w="80"/>
-              <w:left w:type="dxa" w:w="120"/>
-              <w:bottom w:type="dxa" w:w="80"/>
-              <w:right w:type="dxa" w:w="120"/>
-            </w:tcMar>
-          </w:tcPr>
-          <w:p>
-            <w:pPr>
-              <w:jc w:val="left"/>
-            </w:pPr>
-            <w:r>
-              <w:rPr>
-                <w:rFonts w:ascii="Arial" w:cs="Arial" w:eastAsia="Arial" w:hAnsi="Arial"/>
-                <w:b w:val="false"/>
-                <w:bCs w:val="false"/>
-                <w:color w:val="000000"/>
-                <w:sz w:val="20"/>
-                <w:szCs w:val="20"/>
-              </w:rPr>
-              <w:t xml:space="preserve">Bonus: correct cards total</w:t>
-            </w:r>
-          </w:p>
-        </w:tc>
-        <w:tc>
-          <w:tcPr>
-            <w:tcW w:type="dxa" w:w="2000"/>
-            <w:tcBorders>
-              <w:top w:val="single" w:color="AAAAAA" w:sz="1"/>
-              <w:left w:val="single" w:color="AAAAAA" w:sz="1"/>
-              <w:bottom w:val="single" w:color="AAAAAA" w:sz="1"/>
-              <w:right w:val="single" w:color="AAAAAA" w:sz="1"/>
-            </w:tcBorders>
-            <w:shd w:fill="FFFFFF" w:val="clear"/>
-            <w:tcMar>
-              <w:top w:type="dxa" w:w="80"/>
-              <w:left w:type="dxa" w:w="120"/>
-              <w:bottom w:type="dxa" w:w="80"/>
-              <w:right w:type="dxa" w:w="120"/>
-            </w:tcMar>
-          </w:tcPr>
-          <w:p>
-            <w:pPr>
-              <w:jc w:val="left"/>
-            </w:pPr>
-            <w:r>
-              <w:rPr>
-                <w:rFonts w:ascii="Arial" w:cs="Arial" w:eastAsia="Arial" w:hAnsi="Arial"/>
-                <w:b w:val="false"/>
-                <w:bCs w:val="false"/>
-                <w:color w:val="000000"/>
-                <w:sz w:val="20"/>
-                <w:szCs w:val="20"/>
-              </w:rPr>
-              <w:t xml:space="preserve">1 point</w:t>
-            </w:r>
-          </w:p>
-        </w:tc>
-        <w:tc>
-          <w:tcPr>
-            <w:tcW w:type="dxa" w:w="1400"/>
-            <w:tcBorders>
-              <w:top w:val="single" w:color="AAAAAA" w:sz="1"/>
-              <w:left w:val="single" w:color="AAAAAA" w:sz="1"/>
-              <w:bottom w:val="single" w:color="AAAAAA" w:sz="1"/>
-              <w:right w:val="single" w:color="AAAAAA" w:sz="1"/>
-            </w:tcBorders>
-            <w:shd w:fill="FFFFFF" w:val="clear"/>
-            <w:tcMar>
-              <w:top w:type="dxa" w:w="80"/>
-              <w:left w:type="dxa" w:w="120"/>
-              <w:bottom w:type="dxa" w:w="80"/>
-              <w:right w:type="dxa" w:w="120"/>
-            </w:tcMar>
-          </w:tcPr>
-          <w:p>
-            <w:pPr>
-              <w:jc w:val="left"/>
-            </w:pPr>
-            <w:r>
-              <w:rPr>
-                <w:rFonts w:ascii="Arial" w:cs="Arial" w:eastAsia="Arial" w:hAnsi="Arial"/>
-                <w:b w:val="false"/>
-                <w:bCs w:val="false"/>
-                <w:color w:val="000000"/>
-                <w:sz w:val="20"/>
-                <w:szCs w:val="20"/>
-              </w:rPr>
-              <w:t xml:space="preserve">0</w:t>
-            </w:r>
-          </w:p>
-        </w:tc>
-        <w:tc>
-          <w:tcPr>
-            <w:tcW w:type="dxa" w:w="1400"/>
-            <w:tcBorders>
-              <w:top w:val="single" w:color="AAAAAA" w:sz="1"/>
-              <w:left w:val="single" w:color="AAAAAA" w:sz="1"/>
-              <w:bottom w:val="single" w:color="AAAAAA" w:sz="1"/>
-              <w:right w:val="single" w:color="AAAAAA" w:sz="1"/>
-            </w:tcBorders>
-            <w:shd w:fill="FFFFFF" w:val="clear"/>
-            <w:tcMar>
-              <w:top w:type="dxa" w:w="80"/>
-              <w:left w:type="dxa" w:w="120"/>
-              <w:bottom w:type="dxa" w:w="80"/>
-              <w:right w:type="dxa" w:w="120"/>
-            </w:tcMar>
-          </w:tcPr>
-          <w:p>
-            <w:pPr>
-              <w:jc w:val="left"/>
-            </w:pPr>
-            <w:r>
-              <w:rPr>
-                <w:rFonts w:ascii="Arial" w:cs="Arial" w:eastAsia="Arial" w:hAnsi="Arial"/>
-                <w:b w:val="false"/>
-                <w:bCs w:val="false"/>
-                <w:color w:val="000000"/>
-                <w:sz w:val="20"/>
-                <w:szCs w:val="20"/>
-              </w:rPr>
-              <w:t xml:space="preserve">3</w:t>
-            </w:r>
-          </w:p>
-        </w:tc>
-      </w:tr>
-      <w:tr>
-        <w:tc>
-          <w:tcPr>
-            <w:tcW w:type="dxa" w:w="3000"/>
-            <w:tcBorders>
-              <w:top w:val="single" w:color="AAAAAA" w:sz="1"/>
-              <w:left w:val="single" w:color="AAAAAA" w:sz="1"/>
-              <w:bottom w:val="single" w:color="AAAAAA" w:sz="1"/>
-              <w:right w:val="single" w:color="AAAAAA" w:sz="1"/>
-            </w:tcBorders>
-            <w:shd w:fill="F2F2F2" w:val="clear"/>
-            <w:tcMar>
-              <w:top w:type="dxa" w:w="80"/>
-              <w:left w:type="dxa" w:w="120"/>
-              <w:bottom w:type="dxa" w:w="80"/>
-              <w:right w:type="dxa" w:w="120"/>
-            </w:tcMar>
-          </w:tcPr>
-          <w:p>
-            <w:pPr>
-              <w:jc w:val="left"/>
-            </w:pPr>
-            <w:r>
-              <w:rPr>
-                <w:rFonts w:ascii="Arial" w:cs="Arial" w:eastAsia="Arial" w:hAnsi="Arial"/>
-                <w:b w:val="false"/>
-                <w:bCs w:val="false"/>
-                <w:color w:val="000000"/>
-                <w:sz w:val="20"/>
-                <w:szCs w:val="20"/>
-              </w:rPr>
-              <w:t xml:space="preserve">Bonus: correct team to kick off</w:t>
-            </w:r>
-          </w:p>
-        </w:tc>
-        <w:tc>
-          <w:tcPr>
-            <w:tcW w:type="dxa" w:w="2000"/>
-            <w:tcBorders>
-              <w:top w:val="single" w:color="AAAAAA" w:sz="1"/>
-              <w:left w:val="single" w:color="AAAAAA" w:sz="1"/>
-              <w:bottom w:val="single" w:color="AAAAAA" w:sz="1"/>
-              <w:right w:val="single" w:color="AAAAAA" w:sz="1"/>
-            </w:tcBorders>
-            <w:shd w:fill="F2F2F2" w:val="clear"/>
-            <w:tcMar>
-              <w:top w:type="dxa" w:w="80"/>
-              <w:left w:type="dxa" w:w="120"/>
-              <w:bottom w:type="dxa" w:w="80"/>
-              <w:right w:type="dxa" w:w="120"/>
-            </w:tcMar>
-          </w:tcPr>
-          <w:p>
-            <w:pPr>
-              <w:jc w:val="left"/>
-            </w:pPr>
-            <w:r>
-              <w:rPr>
-                <w:rFonts w:ascii="Arial" w:cs="Arial" w:eastAsia="Arial" w:hAnsi="Arial"/>
-                <w:b w:val="false"/>
-                <w:bCs w:val="false"/>
-                <w:color w:val="000000"/>
-                <w:sz w:val="20"/>
-                <w:szCs w:val="20"/>
-              </w:rPr>
-              <w:t xml:space="preserve">1 point</w:t>
-            </w:r>
-          </w:p>
-        </w:tc>
-        <w:tc>
-          <w:tcPr>
-            <w:tcW w:type="dxa" w:w="1400"/>
-            <w:tcBorders>
-              <w:top w:val="single" w:color="AAAAAA" w:sz="1"/>
-              <w:left w:val="single" w:color="AAAAAA" w:sz="1"/>
-              <w:bottom w:val="single" w:color="AAAAAA" w:sz="1"/>
-              <w:right w:val="single" w:color="AAAAAA" w:sz="1"/>
-            </w:tcBorders>
-            <w:shd w:fill="F2F2F2" w:val="clear"/>
-            <w:tcMar>
-              <w:top w:type="dxa" w:w="80"/>
-              <w:left w:type="dxa" w:w="120"/>
-              <w:bottom w:type="dxa" w:w="80"/>
-              <w:right w:type="dxa" w:w="120"/>
-            </w:tcMar>
-          </w:tcPr>
-          <w:p>
-            <w:pPr>
-              <w:jc w:val="left"/>
-            </w:pPr>
-            <w:r>
-              <w:rPr>
-                <w:rFonts w:ascii="Arial" w:cs="Arial" w:eastAsia="Arial" w:hAnsi="Arial"/>
-                <w:b w:val="false"/>
-                <w:bCs w:val="false"/>
-                <w:color w:val="000000"/>
-                <w:sz w:val="20"/>
-                <w:szCs w:val="20"/>
-              </w:rPr>
-              <w:t xml:space="preserve">0</w:t>
-            </w:r>
-          </w:p>
-        </w:tc>
-        <w:tc>
-          <w:tcPr>
-            <w:tcW w:type="dxa" w:w="1400"/>
-            <w:tcBorders>
-              <w:top w:val="single" w:color="AAAAAA" w:sz="1"/>
-              <w:left w:val="single" w:color="AAAAAA" w:sz="1"/>
-              <w:bottom w:val="single" w:color="AAAAAA" w:sz="1"/>
-              <w:right w:val="single" w:color="AAAAAA" w:sz="1"/>
-            </w:tcBorders>
-            <w:shd w:fill="F2F2F2" w:val="clear"/>
-            <w:tcMar>
-              <w:top w:type="dxa" w:w="80"/>
-              <w:left w:type="dxa" w:w="120"/>
-              <w:bottom w:type="dxa" w:w="80"/>
-              <w:right w:type="dxa" w:w="120"/>
-            </w:tcMar>
-          </w:tcPr>
-          <w:p>
-            <w:pPr>
-              <w:jc w:val="left"/>
-            </w:pPr>
-            <w:r>
-              <w:rPr>
-                <w:rFonts w:ascii="Arial" w:cs="Arial" w:eastAsia="Arial" w:hAnsi="Arial"/>
-                <w:b w:val="false"/>
-                <w:bCs w:val="false"/>
-                <w:color w:val="000000"/>
-                <w:sz w:val="20"/>
-                <w:szCs w:val="20"/>
-              </w:rPr>
-              <w:t xml:space="preserve">3</w:t>
-            </w:r>
-          </w:p>
-        </w:tc>
-      </w:tr>
-      <w:tr>
-        <w:tc>
-          <w:tcPr>
-            <w:tcW w:type="dxa" w:w="3000"/>
-            <w:tcBorders>
-              <w:top w:val="single" w:color="AAAAAA" w:sz="1"/>
-              <w:left w:val="single" w:color="AAAAAA" w:sz="1"/>
-              <w:bottom w:val="single" w:color="AAAAAA" w:sz="1"/>
-              <w:right w:val="single" w:color="AAAAAA" w:sz="1"/>
-            </w:tcBorders>
-            <w:shd w:fill="FFFFFF" w:val="clear"/>
-            <w:tcMar>
-              <w:top w:type="dxa" w:w="80"/>
-              <w:left w:type="dxa" w:w="120"/>
-              <w:bottom w:type="dxa" w:w="80"/>
-              <w:right w:type="dxa" w:w="120"/>
-            </w:tcMar>
-          </w:tcPr>
-          <w:p>
-            <w:pPr>
-              <w:jc w:val="left"/>
-            </w:pPr>
-            <w:r>
-              <w:rPr>
-                <w:rFonts w:ascii="Arial" w:cs="Arial" w:eastAsia="Arial" w:hAnsi="Arial"/>
-                <w:b w:val="false"/>
-                <w:bCs w:val="false"/>
-                <w:color w:val="000000"/>
-                <w:sz w:val="20"/>
-                <w:szCs w:val="20"/>
-              </w:rPr>
-              <w:t xml:space="preserve">Bonus: correct yellow cards total</w:t>
-            </w:r>
-          </w:p>
-        </w:tc>
-        <w:tc>
-          <w:tcPr>
-            <w:tcW w:type="dxa" w:w="2000"/>
-            <w:tcBorders>
-              <w:top w:val="single" w:color="AAAAAA" w:sz="1"/>
-              <w:left w:val="single" w:color="AAAAAA" w:sz="1"/>
-              <w:bottom w:val="single" w:color="AAAAAA" w:sz="1"/>
-              <w:right w:val="single" w:color="AAAAAA" w:sz="1"/>
-            </w:tcBorders>
-            <w:shd w:fill="FFFFFF" w:val="clear"/>
-            <w:tcMar>
-              <w:top w:type="dxa" w:w="80"/>
-              <w:left w:type="dxa" w:w="120"/>
-              <w:bottom w:type="dxa" w:w="80"/>
-              <w:right w:type="dxa" w:w="120"/>
-            </w:tcMar>
-          </w:tcPr>
-          <w:p>
-            <w:pPr>
-              <w:jc w:val="left"/>
-            </w:pPr>
-            <w:r>
-              <w:rPr>
-                <w:rFonts w:ascii="Arial" w:cs="Arial" w:eastAsia="Arial" w:hAnsi="Arial"/>
-                <w:b w:val="false"/>
-                <w:bCs w:val="false"/>
-                <w:color w:val="000000"/>
-                <w:sz w:val="20"/>
-                <w:szCs w:val="20"/>
-              </w:rPr>
-              <w:t xml:space="preserve">1 point</w:t>
-            </w:r>
-          </w:p>
-        </w:tc>
-        <w:tc>
-          <w:tcPr>
-            <w:tcW w:type="dxa" w:w="1400"/>
-            <w:tcBorders>
-              <w:top w:val="single" w:color="AAAAAA" w:sz="1"/>
-              <w:left w:val="single" w:color="AAAAAA" w:sz="1"/>
-              <w:bottom w:val="single" w:color="AAAAAA" w:sz="1"/>
-              <w:right w:val="single" w:color="AAAAAA" w:sz="1"/>
-            </w:tcBorders>
-            <w:shd w:fill="FFFFFF" w:val="clear"/>
-            <w:tcMar>
-              <w:top w:type="dxa" w:w="80"/>
-              <w:left w:type="dxa" w:w="120"/>
-              <w:bottom w:type="dxa" w:w="80"/>
-              <w:right w:type="dxa" w:w="120"/>
-            </w:tcMar>
-          </w:tcPr>
-          <w:p>
-            <w:pPr>
-              <w:jc w:val="left"/>
-            </w:pPr>
-            <w:r>
-              <w:rPr>
-                <w:rFonts w:ascii="Arial" w:cs="Arial" w:eastAsia="Arial" w:hAnsi="Arial"/>
-                <w:b w:val="false"/>
-                <w:bCs w:val="false"/>
-                <w:color w:val="000000"/>
-                <w:sz w:val="20"/>
-                <w:szCs w:val="20"/>
-              </w:rPr>
-              <w:t xml:space="preserve">0</w:t>
-            </w:r>
-          </w:p>
-        </w:tc>
-        <w:tc>
-          <w:tcPr>
-            <w:tcW w:type="dxa" w:w="1400"/>
-            <w:tcBorders>
-              <w:top w:val="single" w:color="AAAAAA" w:sz="1"/>
-              <w:left w:val="single" w:color="AAAAAA" w:sz="1"/>
-              <w:bottom w:val="single" w:color="AAAAAA" w:sz="1"/>
-              <w:right w:val="single" w:color="AAAAAA" w:sz="1"/>
-            </w:tcBorders>
-            <w:shd w:fill="FFFFFF" w:val="clear"/>
-            <w:tcMar>
-              <w:top w:type="dxa" w:w="80"/>
-              <w:left w:type="dxa" w:w="120"/>
-              <w:bottom w:type="dxa" w:w="80"/>
-              <w:right w:type="dxa" w:w="120"/>
-            </w:tcMar>
-          </w:tcPr>
-          <w:p>
-            <w:pPr>
-              <w:jc w:val="left"/>
-            </w:pPr>
-            <w:r>
-              <w:rPr>
-                <w:rFonts w:ascii="Arial" w:cs="Arial" w:eastAsia="Arial" w:hAnsi="Arial"/>
-                <w:b w:val="false"/>
-                <w:bCs w:val="false"/>
-                <w:color w:val="000000"/>
-                <w:sz w:val="20"/>
-                <w:szCs w:val="20"/>
-              </w:rPr>
-              <w:t xml:space="preserve">3</w:t>
-            </w:r>
-          </w:p>
-        </w:tc>
-      </w:tr>
-      <w:tr>
-        <w:tc>
-          <w:tcPr>
-            <w:tcW w:type="dxa" w:w="3000"/>
-            <w:tcBorders>
-              <w:top w:val="single" w:color="AAAAAA" w:sz="1"/>
-              <w:left w:val="single" w:color="AAAAAA" w:sz="1"/>
-              <w:bottom w:val="single" w:color="AAAAAA" w:sz="1"/>
-              <w:right w:val="single" w:color="AAAAAA" w:sz="1"/>
-            </w:tcBorders>
-            <w:shd w:fill="F2F2F2" w:val="clear"/>
-            <w:tcMar>
-              <w:top w:type="dxa" w:w="80"/>
-              <w:left w:type="dxa" w:w="120"/>
-              <w:bottom w:type="dxa" w:w="80"/>
-              <w:right w:type="dxa" w:w="120"/>
-            </w:tcMar>
-          </w:tcPr>
-          <w:p>
-            <w:pPr>
-              <w:jc w:val="left"/>
-            </w:pPr>
-            <w:r>
-              <w:rPr>
-                <w:rFonts w:ascii="Arial" w:cs="Arial" w:eastAsia="Arial" w:hAnsi="Arial"/>
-                <w:b w:val="false"/>
-                <w:bCs w:val="false"/>
-                <w:color w:val="000000"/>
-                <w:sz w:val="20"/>
-                <w:szCs w:val="20"/>
-              </w:rPr>
-              <w:t xml:space="preserve">Bonus: correct red cards total</w:t>
-            </w:r>
-          </w:p>
-        </w:tc>
-        <w:tc>
-          <w:tcPr>
-            <w:tcW w:type="dxa" w:w="2000"/>
-            <w:tcBorders>
-              <w:top w:val="single" w:color="AAAAAA" w:sz="1"/>
-              <w:left w:val="single" w:color="AAAAAA" w:sz="1"/>
-              <w:bottom w:val="single" w:color="AAAAAA" w:sz="1"/>
-              <w:right w:val="single" w:color="AAAAAA" w:sz="1"/>
-            </w:tcBorders>
-            <w:shd w:fill="F2F2F2" w:val="clear"/>
-            <w:tcMar>
-              <w:top w:type="dxa" w:w="80"/>
-              <w:left w:type="dxa" w:w="120"/>
-              <w:bottom w:type="dxa" w:w="80"/>
-              <w:right w:type="dxa" w:w="120"/>
-            </w:tcMar>
-          </w:tcPr>
-          <w:p>
-            <w:pPr>
-              <w:jc w:val="left"/>
-            </w:pPr>
-            <w:r>
-              <w:rPr>
-                <w:rFonts w:ascii="Arial" w:cs="Arial" w:eastAsia="Arial" w:hAnsi="Arial"/>
-                <w:b w:val="false"/>
-                <w:bCs w:val="false"/>
-                <w:color w:val="000000"/>
-                <w:sz w:val="20"/>
-                <w:szCs w:val="20"/>
-              </w:rPr>
-              <w:t xml:space="preserve">1 point</w:t>
-            </w:r>
-          </w:p>
-        </w:tc>
-        <w:tc>
-          <w:tcPr>
-            <w:tcW w:type="dxa" w:w="1400"/>
-            <w:tcBorders>
-              <w:top w:val="single" w:color="AAAAAA" w:sz="1"/>
-              <w:left w:val="single" w:color="AAAAAA" w:sz="1"/>
-              <w:bottom w:val="single" w:color="AAAAAA" w:sz="1"/>
-              <w:right w:val="single" w:color="AAAAAA" w:sz="1"/>
-            </w:tcBorders>
-            <w:shd w:fill="F2F2F2" w:val="clear"/>
-            <w:tcMar>
-              <w:top w:type="dxa" w:w="80"/>
-              <w:left w:type="dxa" w:w="120"/>
-              <w:bottom w:type="dxa" w:w="80"/>
-              <w:right w:type="dxa" w:w="120"/>
-            </w:tcMar>
-          </w:tcPr>
-          <w:p>
-            <w:pPr>
-              <w:jc w:val="left"/>
-            </w:pPr>
-            <w:r>
-              <w:rPr>
-                <w:rFonts w:ascii="Arial" w:cs="Arial" w:eastAsia="Arial" w:hAnsi="Arial"/>
-                <w:b w:val="false"/>
-                <w:bCs w:val="false"/>
-                <w:color w:val="000000"/>
-                <w:sz w:val="20"/>
-                <w:szCs w:val="20"/>
-              </w:rPr>
-              <w:t xml:space="preserve">0</w:t>
-            </w:r>
-          </w:p>
-        </w:tc>
-        <w:tc>
-          <w:tcPr>
-            <w:tcW w:type="dxa" w:w="1400"/>
-            <w:tcBorders>
-              <w:top w:val="single" w:color="AAAAAA" w:sz="1"/>
-              <w:left w:val="single" w:color="AAAAAA" w:sz="1"/>
-              <w:bottom w:val="single" w:color="AAAAAA" w:sz="1"/>
-              <w:right w:val="single" w:color="AAAAAA" w:sz="1"/>
-            </w:tcBorders>
-            <w:shd w:fill="F2F2F2" w:val="clear"/>
-            <w:tcMar>
-              <w:top w:type="dxa" w:w="80"/>
-              <w:left w:type="dxa" w:w="120"/>
-              <w:bottom w:type="dxa" w:w="80"/>
-              <w:right w:type="dxa" w:w="120"/>
-            </w:tcMar>
-          </w:tcPr>
-          <w:p>
-            <w:pPr>
-              <w:jc w:val="left"/>
-            </w:pPr>
-            <w:r>
-              <w:rPr>
-                <w:rFonts w:ascii="Arial" w:cs="Arial" w:eastAsia="Arial" w:hAnsi="Arial"/>
-                <w:b w:val="false"/>
-                <w:bCs w:val="false"/>
-                <w:color w:val="000000"/>
-                <w:sz w:val="20"/>
-                <w:szCs w:val="20"/>
-              </w:rPr>
-              <w:t xml:space="preserve">3</w:t>
-            </w:r>
-          </w:p>
-        </w:tc>
-      </w:tr>
-      <w:tr>
-        <w:tc>
-          <w:tcPr>
-            <w:tcW w:type="dxa" w:w="3000"/>
-            <w:tcBorders>
-              <w:top w:val="single" w:color="AAAAAA" w:sz="1"/>
-              <w:left w:val="single" w:color="AAAAAA" w:sz="1"/>
-              <w:bottom w:val="single" w:color="AAAAAA" w:sz="1"/>
-              <w:right w:val="single" w:color="AAAAAA" w:sz="1"/>
-            </w:tcBorders>
-            <w:shd w:fill="FFFFFF" w:val="clear"/>
-            <w:tcMar>
-              <w:top w:type="dxa" w:w="80"/>
-              <w:left w:type="dxa" w:w="120"/>
-              <w:bottom w:type="dxa" w:w="80"/>
-              <w:right w:type="dxa" w:w="120"/>
-            </w:tcMar>
-          </w:tcPr>
-          <w:p>
-            <w:pPr>
-              <w:jc w:val="left"/>
-            </w:pPr>
-            <w:r>
-              <w:rPr>
-                <w:rFonts w:ascii="Arial" w:cs="Arial" w:eastAsia="Arial" w:hAnsi="Arial"/>
-                <w:b w:val="false"/>
-                <w:bCs w:val="false"/>
-                <w:color w:val="000000"/>
-                <w:sz w:val="20"/>
-                <w:szCs w:val="20"/>
-              </w:rPr>
-              <w:t xml:space="preserve">Bonus: correct minute of first goal (±5 min)</w:t>
-            </w:r>
-          </w:p>
-        </w:tc>
-        <w:tc>
-          <w:tcPr>
-            <w:tcW w:type="dxa" w:w="2000"/>
-            <w:tcBorders>
-              <w:top w:val="single" w:color="AAAAAA" w:sz="1"/>
-              <w:left w:val="single" w:color="AAAAAA" w:sz="1"/>
-              <w:bottom w:val="single" w:color="AAAAAA" w:sz="1"/>
-              <w:right w:val="single" w:color="AAAAAA" w:sz="1"/>
-            </w:tcBorders>
-            <w:shd w:fill="FFFFFF" w:val="clear"/>
-            <w:tcMar>
-              <w:top w:type="dxa" w:w="80"/>
-              <w:left w:type="dxa" w:w="120"/>
-              <w:bottom w:type="dxa" w:w="80"/>
-              <w:right w:type="dxa" w:w="120"/>
-            </w:tcMar>
-          </w:tcPr>
-          <w:p>
-            <w:pPr>
-              <w:jc w:val="left"/>
-            </w:pPr>
-            <w:r>
-              <w:rPr>
-                <w:rFonts w:ascii="Arial" w:cs="Arial" w:eastAsia="Arial" w:hAnsi="Arial"/>
-                <w:b w:val="false"/>
-                <w:bCs w:val="false"/>
-                <w:color w:val="000000"/>
-                <w:sz w:val="20"/>
-                <w:szCs w:val="20"/>
-              </w:rPr>
-              <w:t xml:space="preserve">2 points</w:t>
-            </w:r>
-          </w:p>
-        </w:tc>
-        <w:tc>
-          <w:tcPr>
-            <w:tcW w:type="dxa" w:w="1400"/>
-            <w:tcBorders>
-              <w:top w:val="single" w:color="AAAAAA" w:sz="1"/>
-              <w:left w:val="single" w:color="AAAAAA" w:sz="1"/>
-              <w:bottom w:val="single" w:color="AAAAAA" w:sz="1"/>
-              <w:right w:val="single" w:color="AAAAAA" w:sz="1"/>
-            </w:tcBorders>
-            <w:shd w:fill="FFFFFF" w:val="clear"/>
-            <w:tcMar>
-              <w:top w:type="dxa" w:w="80"/>
-              <w:left w:type="dxa" w:w="120"/>
-              <w:bottom w:type="dxa" w:w="80"/>
-              <w:right w:type="dxa" w:w="120"/>
-            </w:tcMar>
-          </w:tcPr>
-          <w:p>
-            <w:pPr>
-              <w:jc w:val="left"/>
-            </w:pPr>
-            <w:r>
-              <w:rPr>
-                <w:rFonts w:ascii="Arial" w:cs="Arial" w:eastAsia="Arial" w:hAnsi="Arial"/>
-                <w:b w:val="false"/>
-                <w:bCs w:val="false"/>
-                <w:color w:val="000000"/>
-                <w:sz w:val="20"/>
-                <w:szCs w:val="20"/>
-              </w:rPr>
-              <w:t xml:space="preserve">0</w:t>
-            </w:r>
-          </w:p>
-        </w:tc>
-        <w:tc>
-          <w:tcPr>
-            <w:tcW w:type="dxa" w:w="1400"/>
-            <w:tcBorders>
-              <w:top w:val="single" w:color="AAAAAA" w:sz="1"/>
-              <w:left w:val="single" w:color="AAAAAA" w:sz="1"/>
-              <w:bottom w:val="single" w:color="AAAAAA" w:sz="1"/>
-              <w:right w:val="single" w:color="AAAAAA" w:sz="1"/>
-            </w:tcBorders>
-            <w:shd w:fill="FFFFFF" w:val="clear"/>
-            <w:tcMar>
-              <w:top w:type="dxa" w:w="80"/>
-              <w:left w:type="dxa" w:w="120"/>
-              <w:bottom w:type="dxa" w:w="80"/>
-              <w:right w:type="dxa" w:w="120"/>
-            </w:tcMar>
-          </w:tcPr>
-          <w:p>
-            <w:pPr>
-              <w:jc w:val="left"/>
-            </w:pPr>
-            <w:r>
-              <w:rPr>
-                <w:rFonts w:ascii="Arial" w:cs="Arial" w:eastAsia="Arial" w:hAnsi="Arial"/>
-                <w:b w:val="false"/>
-                <w:bCs w:val="false"/>
-                <w:color w:val="000000"/>
-                <w:sz w:val="20"/>
-                <w:szCs w:val="20"/>
-              </w:rPr>
-              <w:t xml:space="preserve">5</w:t>
-            </w:r>
-          </w:p>
-        </w:tc>
-      </w:tr>
-      <w:tr>
-        <w:tc>
-          <w:tcPr>
-            <w:tcW w:type="dxa" w:w="3000"/>
-            <w:tcBorders>
-              <w:top w:val="single" w:color="AAAAAA" w:sz="1"/>
-              <w:left w:val="single" w:color="AAAAAA" w:sz="1"/>
-              <w:bottom w:val="single" w:color="AAAAAA" w:sz="1"/>
-              <w:right w:val="single" w:color="AAAAAA" w:sz="1"/>
-            </w:tcBorders>
-            <w:shd w:fill="F2F2F2" w:val="clear"/>
-            <w:tcMar>
-              <w:top w:type="dxa" w:w="80"/>
-              <w:left w:type="dxa" w:w="120"/>
-              <w:bottom w:type="dxa" w:w="80"/>
-              <w:right w:type="dxa" w:w="120"/>
-            </w:tcMar>
-          </w:tcPr>
-          <w:p>
-            <w:pPr>
-              <w:jc w:val="left"/>
-            </w:pPr>
-            <w:r>
-              <w:rPr>
-                <w:rFonts w:ascii="Arial" w:cs="Arial" w:eastAsia="Arial" w:hAnsi="Arial"/>
-                <w:b w:val="false"/>
-                <w:bCs w:val="false"/>
-                <w:color w:val="000000"/>
-                <w:sz w:val="20"/>
-                <w:szCs w:val="20"/>
-              </w:rPr>
-              <w:t xml:space="preserve">Bonus: correct penalty prediction (yes/no)</w:t>
-            </w:r>
-          </w:p>
-        </w:tc>
-        <w:tc>
-          <w:tcPr>
-            <w:tcW w:type="dxa" w:w="2000"/>
-            <w:tcBorders>
-              <w:top w:val="single" w:color="AAAAAA" w:sz="1"/>
-              <w:left w:val="single" w:color="AAAAAA" w:sz="1"/>
-              <w:bottom w:val="single" w:color="AAAAAA" w:sz="1"/>
-              <w:right w:val="single" w:color="AAAAAA" w:sz="1"/>
-            </w:tcBorders>
-            <w:shd w:fill="F2F2F2" w:val="clear"/>
-            <w:tcMar>
-              <w:top w:type="dxa" w:w="80"/>
-              <w:left w:type="dxa" w:w="120"/>
-              <w:bottom w:type="dxa" w:w="80"/>
-              <w:right w:type="dxa" w:w="120"/>
-            </w:tcMar>
-          </w:tcPr>
-          <w:p>
-            <w:pPr>
-              <w:jc w:val="left"/>
-            </w:pPr>
-            <w:r>
-              <w:rPr>
-                <w:rFonts w:ascii="Arial" w:cs="Arial" w:eastAsia="Arial" w:hAnsi="Arial"/>
-                <w:b w:val="false"/>
-                <w:bCs w:val="false"/>
-                <w:color w:val="000000"/>
-                <w:sz w:val="20"/>
-                <w:szCs w:val="20"/>
-              </w:rPr>
-              <w:t xml:space="preserve">1 point</w:t>
-            </w:r>
-          </w:p>
-        </w:tc>
-        <w:tc>
-          <w:tcPr>
-            <w:tcW w:type="dxa" w:w="1400"/>
-            <w:tcBorders>
-              <w:top w:val="single" w:color="AAAAAA" w:sz="1"/>
-              <w:left w:val="single" w:color="AAAAAA" w:sz="1"/>
-              <w:bottom w:val="single" w:color="AAAAAA" w:sz="1"/>
-              <w:right w:val="single" w:color="AAAAAA" w:sz="1"/>
-            </w:tcBorders>
-            <w:shd w:fill="F2F2F2" w:val="clear"/>
-            <w:tcMar>
-              <w:top w:type="dxa" w:w="80"/>
-              <w:left w:type="dxa" w:w="120"/>
-              <w:bottom w:type="dxa" w:w="80"/>
-              <w:right w:type="dxa" w:w="120"/>
-            </w:tcMar>
-          </w:tcPr>
-          <w:p>
-            <w:pPr>
-              <w:jc w:val="left"/>
-            </w:pPr>
-            <w:r>
-              <w:rPr>
-                <w:rFonts w:ascii="Arial" w:cs="Arial" w:eastAsia="Arial" w:hAnsi="Arial"/>
-                <w:b w:val="false"/>
-                <w:bCs w:val="false"/>
-                <w:color w:val="000000"/>
-                <w:sz w:val="20"/>
-                <w:szCs w:val="20"/>
-              </w:rPr>
-              <w:t xml:space="preserve">0</w:t>
-            </w:r>
-          </w:p>
-        </w:tc>
-        <w:tc>
-          <w:tcPr>
-            <w:tcW w:type="dxa" w:w="1400"/>
-            <w:tcBorders>
-              <w:top w:val="single" w:color="AAAAAA" w:sz="1"/>
-              <w:left w:val="single" w:color="AAAAAA" w:sz="1"/>
-              <w:bottom w:val="single" w:color="AAAAAA" w:sz="1"/>
-              <w:right w:val="single" w:color="AAAAAA" w:sz="1"/>
-            </w:tcBorders>
-            <w:shd w:fill="F2F2F2" w:val="clear"/>
-            <w:tcMar>
-              <w:top w:type="dxa" w:w="80"/>
-              <w:left w:type="dxa" w:w="120"/>
-              <w:bottom w:type="dxa" w:w="80"/>
-              <w:right w:type="dxa" w:w="120"/>
-            </w:tcMar>
-          </w:tcPr>
-          <w:p>
-            <w:pPr>
-              <w:jc w:val="left"/>
-            </w:pPr>
-            <w:r>
-              <w:rPr>
-                <w:rFonts w:ascii="Arial" w:cs="Arial" w:eastAsia="Arial" w:hAnsi="Arial"/>
-                <w:b w:val="false"/>
-                <w:bCs w:val="false"/>
-                <w:color w:val="000000"/>
-                <w:sz w:val="20"/>
-                <w:szCs w:val="20"/>
-              </w:rPr>
-              <w:t xml:space="preserve">3</w:t>
-            </w:r>
-          </w:p>
-        </w:tc>
-      </w:tr>
-      <w:tr>
-        <w:tc>
-          <w:tcPr>
-            <w:tcW w:type="dxa" w:w="3000"/>
-            <w:tcBorders>
-              <w:top w:val="single" w:color="AAAAAA" w:sz="1"/>
-              <w:left w:val="single" w:color="AAAAAA" w:sz="1"/>
-              <w:bottom w:val="single" w:color="AAAAAA" w:sz="1"/>
-              <w:right w:val="single" w:color="AAAAAA" w:sz="1"/>
-            </w:tcBorders>
-            <w:shd w:fill="FFFFFF" w:val="clear"/>
-            <w:tcMar>
-              <w:top w:type="dxa" w:w="80"/>
-              <w:left w:type="dxa" w:w="120"/>
-              <w:bottom w:type="dxa" w:w="80"/>
-              <w:right w:type="dxa" w:w="120"/>
-            </w:tcMar>
-          </w:tcPr>
-          <w:p>
-            <w:pPr>
-              <w:jc w:val="left"/>
-            </w:pPr>
-            <w:r>
-              <w:rPr>
-                <w:rFonts w:ascii="Arial" w:cs="Arial" w:eastAsia="Arial" w:hAnsi="Arial"/>
-                <w:b w:val="false"/>
-                <w:bCs w:val="false"/>
-                <w:color w:val="000000"/>
-                <w:sz w:val="20"/>
-                <w:szCs w:val="20"/>
-              </w:rPr>
-              <w:t xml:space="preserve">Bonus: correct substitutions per team</w:t>
-            </w:r>
-          </w:p>
-        </w:tc>
-        <w:tc>
-          <w:tcPr>
-            <w:tcW w:type="dxa" w:w="2000"/>
-            <w:tcBorders>
-              <w:top w:val="single" w:color="AAAAAA" w:sz="1"/>
-              <w:left w:val="single" w:color="AAAAAA" w:sz="1"/>
-              <w:bottom w:val="single" w:color="AAAAAA" w:sz="1"/>
-              <w:right w:val="single" w:color="AAAAAA" w:sz="1"/>
-            </w:tcBorders>
-            <w:shd w:fill="FFFFFF" w:val="clear"/>
-            <w:tcMar>
-              <w:top w:type="dxa" w:w="80"/>
-              <w:left w:type="dxa" w:w="120"/>
-              <w:bottom w:type="dxa" w:w="80"/>
-              <w:right w:type="dxa" w:w="120"/>
-            </w:tcMar>
-          </w:tcPr>
-          <w:p>
-            <w:pPr>
-              <w:jc w:val="left"/>
-            </w:pPr>
-            <w:r>
-              <w:rPr>
-                <w:rFonts w:ascii="Arial" w:cs="Arial" w:eastAsia="Arial" w:hAnsi="Arial"/>
-                <w:b w:val="false"/>
-                <w:bCs w:val="false"/>
-                <w:color w:val="000000"/>
-                <w:sz w:val="20"/>
-                <w:szCs w:val="20"/>
-              </w:rPr>
-              <w:t xml:space="preserve">1 point</w:t>
-            </w:r>
-          </w:p>
-        </w:tc>
-        <w:tc>
-          <w:tcPr>
-            <w:tcW w:type="dxa" w:w="1400"/>
-            <w:tcBorders>
-              <w:top w:val="single" w:color="AAAAAA" w:sz="1"/>
-              <w:left w:val="single" w:color="AAAAAA" w:sz="1"/>
-              <w:bottom w:val="single" w:color="AAAAAA" w:sz="1"/>
-              <w:right w:val="single" w:color="AAAAAA" w:sz="1"/>
-            </w:tcBorders>
-            <w:shd w:fill="FFFFFF" w:val="clear"/>
-            <w:tcMar>
-              <w:top w:type="dxa" w:w="80"/>
-              <w:left w:type="dxa" w:w="120"/>
-              <w:bottom w:type="dxa" w:w="80"/>
-              <w:right w:type="dxa" w:w="120"/>
-            </w:tcMar>
-          </w:tcPr>
-          <w:p>
-            <w:pPr>
-              <w:jc w:val="left"/>
-            </w:pPr>
-            <w:r>
-              <w:rPr>
-                <w:rFonts w:ascii="Arial" w:cs="Arial" w:eastAsia="Arial" w:hAnsi="Arial"/>
-                <w:b w:val="false"/>
-                <w:bCs w:val="false"/>
-                <w:color w:val="000000"/>
-                <w:sz w:val="20"/>
-                <w:szCs w:val="20"/>
-              </w:rPr>
-              <w:t xml:space="preserve">0</w:t>
-            </w:r>
-          </w:p>
-        </w:tc>
-        <w:tc>
-          <w:tcPr>
-            <w:tcW w:type="dxa" w:w="1400"/>
-            <w:tcBorders>
-              <w:top w:val="single" w:color="AAAAAA" w:sz="1"/>
-              <w:left w:val="single" w:color="AAAAAA" w:sz="1"/>
-              <w:bottom w:val="single" w:color="AAAAAA" w:sz="1"/>
-              <w:right w:val="single" w:color="AAAAAA" w:sz="1"/>
-            </w:tcBorders>
-            <w:shd w:fill="FFFFFF" w:val="clear"/>
-            <w:tcMar>
-              <w:top w:type="dxa" w:w="80"/>
-              <w:left w:type="dxa" w:w="120"/>
-              <w:bottom w:type="dxa" w:w="80"/>
-              <w:right w:type="dxa" w:w="120"/>
-            </w:tcMar>
-          </w:tcPr>
-          <w:p>
-            <w:pPr>
-              <w:jc w:val="left"/>
-            </w:pPr>
-            <w:r>
-              <w:rPr>
-                <w:rFonts w:ascii="Arial" w:cs="Arial" w:eastAsia="Arial" w:hAnsi="Arial"/>
-                <w:b w:val="false"/>
-                <w:bCs w:val="false"/>
-                <w:color w:val="000000"/>
-                <w:sz w:val="20"/>
-                <w:szCs w:val="20"/>
-              </w:rPr>
-              <w:t xml:space="preserve">3</w:t>
-            </w:r>
-          </w:p>
-        </w:tc>
-      </w:tr>
-      <w:tr>
-        <w:tc>
-          <w:tcPr>
-            <w:tcW w:type="dxa" w:w="3000"/>
-            <w:tcBorders>
-              <w:top w:val="single" w:color="AAAAAA" w:sz="1"/>
-              <w:left w:val="single" w:color="AAAAAA" w:sz="1"/>
-              <w:bottom w:val="single" w:color="AAAAAA" w:sz="1"/>
-              <w:right w:val="single" w:color="AAAAAA" w:sz="1"/>
-            </w:tcBorders>
-            <w:shd w:fill="F2F2F2" w:val="clear"/>
-            <w:tcMar>
-              <w:top w:type="dxa" w:w="80"/>
-              <w:left w:type="dxa" w:w="120"/>
-              <w:bottom w:type="dxa" w:w="80"/>
-              <w:right w:type="dxa" w:w="120"/>
-            </w:tcMar>
-          </w:tcPr>
-          <w:p>
-            <w:pPr>
-              <w:jc w:val="left"/>
-            </w:pPr>
-            <w:r>
-              <w:rPr>
-                <w:rFonts w:ascii="Arial" w:cs="Arial" w:eastAsia="Arial" w:hAnsi="Arial"/>
-                <w:b w:val="false"/>
-                <w:bCs w:val="false"/>
-                <w:color w:val="000000"/>
-                <w:sz w:val="20"/>
-                <w:szCs w:val="20"/>
-              </w:rPr>
-              <w:t xml:space="preserve">Points multiplier Round of 16</w:t>
-            </w:r>
-          </w:p>
-        </w:tc>
-        <w:tc>
-          <w:tcPr>
-            <w:tcW w:type="dxa" w:w="2000"/>
-            <w:tcBorders>
-              <w:top w:val="single" w:color="AAAAAA" w:sz="1"/>
-              <w:left w:val="single" w:color="AAAAAA" w:sz="1"/>
-              <w:bottom w:val="single" w:color="AAAAAA" w:sz="1"/>
-              <w:right w:val="single" w:color="AAAAAA" w:sz="1"/>
-            </w:tcBorders>
-            <w:shd w:fill="F2F2F2" w:val="clear"/>
-            <w:tcMar>
-              <w:top w:type="dxa" w:w="80"/>
-              <w:left w:type="dxa" w:w="120"/>
-              <w:bottom w:type="dxa" w:w="80"/>
-              <w:right w:type="dxa" w:w="120"/>
-            </w:tcMar>
-          </w:tcPr>
-          <w:p>
-            <w:pPr>
-              <w:jc w:val="left"/>
-            </w:pPr>
-            <w:r>
-              <w:rPr>
-                <w:rFonts w:ascii="Arial" w:cs="Arial" w:eastAsia="Arial" w:hAnsi="Arial"/>
-                <w:b w:val="false"/>
-                <w:bCs w:val="false"/>
-                <w:color w:val="000000"/>
-                <w:sz w:val="20"/>
-                <w:szCs w:val="20"/>
-              </w:rPr>
-              <w:t xml:space="preserve">1.0x (no bonus)</w:t>
-            </w:r>
-          </w:p>
-        </w:tc>
-        <w:tc>
-          <w:tcPr>
-            <w:tcW w:type="dxa" w:w="1400"/>
-            <w:tcBorders>
-              <w:top w:val="single" w:color="AAAAAA" w:sz="1"/>
-              <w:left w:val="single" w:color="AAAAAA" w:sz="1"/>
-              <w:bottom w:val="single" w:color="AAAAAA" w:sz="1"/>
-              <w:right w:val="single" w:color="AAAAAA" w:sz="1"/>
-            </w:tcBorders>
-            <w:shd w:fill="F2F2F2" w:val="clear"/>
-            <w:tcMar>
-              <w:top w:type="dxa" w:w="80"/>
-              <w:left w:type="dxa" w:w="120"/>
-              <w:bottom w:type="dxa" w:w="80"/>
-              <w:right w:type="dxa" w:w="120"/>
-            </w:tcMar>
-          </w:tcPr>
-          <w:p>
-            <w:pPr>
-              <w:jc w:val="left"/>
-            </w:pPr>
-            <w:r>
-              <w:rPr>
-                <w:rFonts w:ascii="Arial" w:cs="Arial" w:eastAsia="Arial" w:hAnsi="Arial"/>
-                <w:b w:val="false"/>
-                <w:bCs w:val="false"/>
-                <w:color w:val="000000"/>
-                <w:sz w:val="20"/>
-                <w:szCs w:val="20"/>
-              </w:rPr>
-              <w:t xml:space="preserve">1.0x</w:t>
-            </w:r>
-          </w:p>
-        </w:tc>
-        <w:tc>
-          <w:tcPr>
-            <w:tcW w:type="dxa" w:w="1400"/>
-            <w:tcBorders>
-              <w:top w:val="single" w:color="AAAAAA" w:sz="1"/>
-              <w:left w:val="single" w:color="AAAAAA" w:sz="1"/>
-              <w:bottom w:val="single" w:color="AAAAAA" w:sz="1"/>
-              <w:right w:val="single" w:color="AAAAAA" w:sz="1"/>
-            </w:tcBorders>
-            <w:shd w:fill="F2F2F2" w:val="clear"/>
-            <w:tcMar>
-              <w:top w:type="dxa" w:w="80"/>
-              <w:left w:type="dxa" w:w="120"/>
-              <w:bottom w:type="dxa" w:w="80"/>
-              <w:right w:type="dxa" w:w="120"/>
-            </w:tcMar>
-          </w:tcPr>
-          <w:p>
-            <w:pPr>
-              <w:jc w:val="left"/>
-            </w:pPr>
-            <w:r>
-              <w:rPr>
-                <w:rFonts w:ascii="Arial" w:cs="Arial" w:eastAsia="Arial" w:hAnsi="Arial"/>
-                <w:b w:val="false"/>
-                <w:bCs w:val="false"/>
-                <w:color w:val="000000"/>
-                <w:sz w:val="20"/>
-                <w:szCs w:val="20"/>
-              </w:rPr>
-              <w:t xml:space="preserve">3.0x</w:t>
-            </w:r>
-          </w:p>
-        </w:tc>
-      </w:tr>
-      <w:tr>
-        <w:tc>
-          <w:tcPr>
-            <w:tcW w:type="dxa" w:w="3000"/>
-            <w:tcBorders>
-              <w:top w:val="single" w:color="AAAAAA" w:sz="1"/>
-              <w:left w:val="single" w:color="AAAAAA" w:sz="1"/>
-              <w:bottom w:val="single" w:color="AAAAAA" w:sz="1"/>
-              <w:right w:val="single" w:color="AAAAAA" w:sz="1"/>
-            </w:tcBorders>
-            <w:shd w:fill="FFFFFF" w:val="clear"/>
-            <w:tcMar>
-              <w:top w:type="dxa" w:w="80"/>
-              <w:left w:type="dxa" w:w="120"/>
-              <w:bottom w:type="dxa" w:w="80"/>
-              <w:right w:type="dxa" w:w="120"/>
-            </w:tcMar>
-          </w:tcPr>
-          <w:p>
-            <w:pPr>
-              <w:jc w:val="left"/>
-            </w:pPr>
-            <w:r>
-              <w:rPr>
-                <w:rFonts w:ascii="Arial" w:cs="Arial" w:eastAsia="Arial" w:hAnsi="Arial"/>
-                <w:b w:val="false"/>
-                <w:bCs w:val="false"/>
-                <w:color w:val="000000"/>
-                <w:sz w:val="20"/>
-                <w:szCs w:val="20"/>
-              </w:rPr>
-              <w:t xml:space="preserve">Points multiplier Quarter-finals</w:t>
-            </w:r>
-          </w:p>
-        </w:tc>
-        <w:tc>
-          <w:tcPr>
-            <w:tcW w:type="dxa" w:w="2000"/>
-            <w:tcBorders>
-              <w:top w:val="single" w:color="AAAAAA" w:sz="1"/>
-              <w:left w:val="single" w:color="AAAAAA" w:sz="1"/>
-              <w:bottom w:val="single" w:color="AAAAAA" w:sz="1"/>
-              <w:right w:val="single" w:color="AAAAAA" w:sz="1"/>
-            </w:tcBorders>
-            <w:shd w:fill="FFFFFF" w:val="clear"/>
-            <w:tcMar>
-              <w:top w:type="dxa" w:w="80"/>
-              <w:left w:type="dxa" w:w="120"/>
-              <w:bottom w:type="dxa" w:w="80"/>
-              <w:right w:type="dxa" w:w="120"/>
-            </w:tcMar>
-          </w:tcPr>
-          <w:p>
-            <w:pPr>
-              <w:jc w:val="left"/>
-            </w:pPr>
-            <w:r>
-              <w:rPr>
-                <w:rFonts w:ascii="Arial" w:cs="Arial" w:eastAsia="Arial" w:hAnsi="Arial"/>
-                <w:b w:val="false"/>
-                <w:bCs w:val="false"/>
-                <w:color w:val="000000"/>
-                <w:sz w:val="20"/>
-                <w:szCs w:val="20"/>
-              </w:rPr>
-              <w:t xml:space="preserve">1.5x</w:t>
-            </w:r>
-          </w:p>
-        </w:tc>
-        <w:tc>
-          <w:tcPr>
-            <w:tcW w:type="dxa" w:w="1400"/>
-            <w:tcBorders>
-              <w:top w:val="single" w:color="AAAAAA" w:sz="1"/>
-              <w:left w:val="single" w:color="AAAAAA" w:sz="1"/>
-              <w:bottom w:val="single" w:color="AAAAAA" w:sz="1"/>
-              <w:right w:val="single" w:color="AAAAAA" w:sz="1"/>
-            </w:tcBorders>
-            <w:shd w:fill="FFFFFF" w:val="clear"/>
-            <w:tcMar>
-              <w:top w:type="dxa" w:w="80"/>
-              <w:left w:type="dxa" w:w="120"/>
-              <w:bottom w:type="dxa" w:w="80"/>
-              <w:right w:type="dxa" w:w="120"/>
-            </w:tcMar>
-          </w:tcPr>
-          <w:p>
-            <w:pPr>
-              <w:jc w:val="left"/>
-            </w:pPr>
-            <w:r>
-              <w:rPr>
-                <w:rFonts w:ascii="Arial" w:cs="Arial" w:eastAsia="Arial" w:hAnsi="Arial"/>
-                <w:b w:val="false"/>
-                <w:bCs w:val="false"/>
-                <w:color w:val="000000"/>
-                <w:sz w:val="20"/>
-                <w:szCs w:val="20"/>
-              </w:rPr>
-              <w:t xml:space="preserve">1.0x</w:t>
-            </w:r>
-          </w:p>
-        </w:tc>
-        <w:tc>
-          <w:tcPr>
-            <w:tcW w:type="dxa" w:w="1400"/>
-            <w:tcBorders>
-              <w:top w:val="single" w:color="AAAAAA" w:sz="1"/>
-              <w:left w:val="single" w:color="AAAAAA" w:sz="1"/>
-              <w:bottom w:val="single" w:color="AAAAAA" w:sz="1"/>
-              <w:right w:val="single" w:color="AAAAAA" w:sz="1"/>
-            </w:tcBorders>
-            <w:shd w:fill="FFFFFF" w:val="clear"/>
-            <w:tcMar>
-              <w:top w:type="dxa" w:w="80"/>
-              <w:left w:type="dxa" w:w="120"/>
-              <w:bottom w:type="dxa" w:w="80"/>
-              <w:right w:type="dxa" w:w="120"/>
-            </w:tcMar>
-          </w:tcPr>
-          <w:p>
-            <w:pPr>
-              <w:jc w:val="left"/>
-            </w:pPr>
-            <w:r>
-              <w:rPr>
-                <w:rFonts w:ascii="Arial" w:cs="Arial" w:eastAsia="Arial" w:hAnsi="Arial"/>
-                <w:b w:val="false"/>
-                <w:bCs w:val="false"/>
-                <w:color w:val="000000"/>
-                <w:sz w:val="20"/>
-                <w:szCs w:val="20"/>
-              </w:rPr>
-              <w:t xml:space="preserve">3.0x</w:t>
-            </w:r>
-          </w:p>
-        </w:tc>
-      </w:tr>
-      <w:tr>
-        <w:tc>
-          <w:tcPr>
-            <w:tcW w:type="dxa" w:w="3000"/>
-            <w:tcBorders>
-              <w:top w:val="single" w:color="AAAAAA" w:sz="1"/>
-              <w:left w:val="single" w:color="AAAAAA" w:sz="1"/>
-              <w:bottom w:val="single" w:color="AAAAAA" w:sz="1"/>
-              <w:right w:val="single" w:color="AAAAAA" w:sz="1"/>
-            </w:tcBorders>
-            <w:shd w:fill="F2F2F2" w:val="clear"/>
-            <w:tcMar>
-              <w:top w:type="dxa" w:w="80"/>
-              <w:left w:type="dxa" w:w="120"/>
-              <w:bottom w:type="dxa" w:w="80"/>
-              <w:right w:type="dxa" w:w="120"/>
-            </w:tcMar>
-          </w:tcPr>
-          <w:p>
-            <w:pPr>
-              <w:jc w:val="left"/>
-            </w:pPr>
-            <w:r>
-              <w:rPr>
-                <w:rFonts w:ascii="Arial" w:cs="Arial" w:eastAsia="Arial" w:hAnsi="Arial"/>
-                <w:b w:val="false"/>
-                <w:bCs w:val="false"/>
-                <w:color w:val="000000"/>
-                <w:sz w:val="20"/>
-                <w:szCs w:val="20"/>
-              </w:rPr>
-              <w:t xml:space="preserve">Points multiplier Semi-finals</w:t>
-            </w:r>
-          </w:p>
-        </w:tc>
-        <w:tc>
-          <w:tcPr>
-            <w:tcW w:type="dxa" w:w="2000"/>
-            <w:tcBorders>
-              <w:top w:val="single" w:color="AAAAAA" w:sz="1"/>
-              <w:left w:val="single" w:color="AAAAAA" w:sz="1"/>
-              <w:bottom w:val="single" w:color="AAAAAA" w:sz="1"/>
-              <w:right w:val="single" w:color="AAAAAA" w:sz="1"/>
-            </w:tcBorders>
-            <w:shd w:fill="F2F2F2" w:val="clear"/>
-            <w:tcMar>
-              <w:top w:type="dxa" w:w="80"/>
-              <w:left w:type="dxa" w:w="120"/>
-              <w:bottom w:type="dxa" w:w="80"/>
-              <w:right w:type="dxa" w:w="120"/>
-            </w:tcMar>
-          </w:tcPr>
-          <w:p>
-            <w:pPr>
-              <w:jc w:val="left"/>
-            </w:pPr>
-            <w:r>
-              <w:rPr>
-                <w:rFonts w:ascii="Arial" w:cs="Arial" w:eastAsia="Arial" w:hAnsi="Arial"/>
-                <w:b w:val="false"/>
-                <w:bCs w:val="false"/>
-                <w:color w:val="000000"/>
-                <w:sz w:val="20"/>
-                <w:szCs w:val="20"/>
-              </w:rPr>
-              <w:t xml:space="preserve">2.0x</w:t>
-            </w:r>
-          </w:p>
-        </w:tc>
-        <w:tc>
-          <w:tcPr>
-            <w:tcW w:type="dxa" w:w="1400"/>
-            <w:tcBorders>
-              <w:top w:val="single" w:color="AAAAAA" w:sz="1"/>
-              <w:left w:val="single" w:color="AAAAAA" w:sz="1"/>
-              <w:bottom w:val="single" w:color="AAAAAA" w:sz="1"/>
-              <w:right w:val="single" w:color="AAAAAA" w:sz="1"/>
-            </w:tcBorders>
-            <w:shd w:fill="F2F2F2" w:val="clear"/>
-            <w:tcMar>
-              <w:top w:type="dxa" w:w="80"/>
-              <w:left w:type="dxa" w:w="120"/>
-              <w:bottom w:type="dxa" w:w="80"/>
-              <w:right w:type="dxa" w:w="120"/>
-            </w:tcMar>
-          </w:tcPr>
-          <w:p>
-            <w:pPr>
-              <w:jc w:val="left"/>
-            </w:pPr>
-            <w:r>
-              <w:rPr>
-                <w:rFonts w:ascii="Arial" w:cs="Arial" w:eastAsia="Arial" w:hAnsi="Arial"/>
-                <w:b w:val="false"/>
-                <w:bCs w:val="false"/>
-                <w:color w:val="000000"/>
-                <w:sz w:val="20"/>
-                <w:szCs w:val="20"/>
-              </w:rPr>
-              <w:t xml:space="preserve">1.0x</w:t>
-            </w:r>
-          </w:p>
-        </w:tc>
-        <w:tc>
-          <w:tcPr>
-            <w:tcW w:type="dxa" w:w="1400"/>
-            <w:tcBorders>
-              <w:top w:val="single" w:color="AAAAAA" w:sz="1"/>
-              <w:left w:val="single" w:color="AAAAAA" w:sz="1"/>
-              <w:bottom w:val="single" w:color="AAAAAA" w:sz="1"/>
-              <w:right w:val="single" w:color="AAAAAA" w:sz="1"/>
-            </w:tcBorders>
-            <w:shd w:fill="F2F2F2" w:val="clear"/>
-            <w:tcMar>
-              <w:top w:type="dxa" w:w="80"/>
-              <w:left w:type="dxa" w:w="120"/>
-              <w:bottom w:type="dxa" w:w="80"/>
-              <w:right w:type="dxa" w:w="120"/>
-            </w:tcMar>
-          </w:tcPr>
-          <w:p>
-            <w:pPr>
-              <w:jc w:val="left"/>
-            </w:pPr>
-            <w:r>
-              <w:rPr>
-                <w:rFonts w:ascii="Arial" w:cs="Arial" w:eastAsia="Arial" w:hAnsi="Arial"/>
-                <w:b w:val="false"/>
-                <w:bCs w:val="false"/>
-                <w:color w:val="000000"/>
-                <w:sz w:val="20"/>
-                <w:szCs w:val="20"/>
-              </w:rPr>
-              <w:t xml:space="preserve">4.0x</w:t>
-            </w:r>
-          </w:p>
-        </w:tc>
-      </w:tr>
-      <w:tr>
-        <w:tc>
-          <w:tcPr>
-            <w:tcW w:type="dxa" w:w="3000"/>
-            <w:tcBorders>
-              <w:top w:val="single" w:color="AAAAAA" w:sz="1"/>
-              <w:left w:val="single" w:color="AAAAAA" w:sz="1"/>
-              <w:bottom w:val="single" w:color="AAAAAA" w:sz="1"/>
-              <w:right w:val="single" w:color="AAAAAA" w:sz="1"/>
-            </w:tcBorders>
-            <w:shd w:fill="FFFFFF" w:val="clear"/>
-            <w:tcMar>
-              <w:top w:type="dxa" w:w="80"/>
-              <w:left w:type="dxa" w:w="120"/>
-              <w:bottom w:type="dxa" w:w="80"/>
-              <w:right w:type="dxa" w:w="120"/>
-            </w:tcMar>
-          </w:tcPr>
-          <w:p>
-            <w:pPr>
-              <w:jc w:val="left"/>
-            </w:pPr>
-            <w:r>
-              <w:rPr>
-                <w:rFonts w:ascii="Arial" w:cs="Arial" w:eastAsia="Arial" w:hAnsi="Arial"/>
-                <w:b w:val="false"/>
-                <w:bCs w:val="false"/>
-                <w:color w:val="000000"/>
-                <w:sz w:val="20"/>
-                <w:szCs w:val="20"/>
-              </w:rPr>
-              <w:t xml:space="preserve">Points multiplier Final</w:t>
-            </w:r>
-          </w:p>
-        </w:tc>
-        <w:tc>
-          <w:tcPr>
-            <w:tcW w:type="dxa" w:w="2000"/>
-            <w:tcBorders>
-              <w:top w:val="single" w:color="AAAAAA" w:sz="1"/>
-              <w:left w:val="single" w:color="AAAAAA" w:sz="1"/>
-              <w:bottom w:val="single" w:color="AAAAAA" w:sz="1"/>
-              <w:right w:val="single" w:color="AAAAAA" w:sz="1"/>
-            </w:tcBorders>
-            <w:shd w:fill="FFFFFF" w:val="clear"/>
-            <w:tcMar>
-              <w:top w:type="dxa" w:w="80"/>
-              <w:left w:type="dxa" w:w="120"/>
-              <w:bottom w:type="dxa" w:w="80"/>
-              <w:right w:type="dxa" w:w="120"/>
-            </w:tcMar>
-          </w:tcPr>
-          <w:p>
-            <w:pPr>
-              <w:jc w:val="left"/>
-            </w:pPr>
-            <w:r>
-              <w:rPr>
-                <w:rFonts w:ascii="Arial" w:cs="Arial" w:eastAsia="Arial" w:hAnsi="Arial"/>
-                <w:b w:val="false"/>
-                <w:bCs w:val="false"/>
-                <w:color w:val="000000"/>
-                <w:sz w:val="20"/>
-                <w:szCs w:val="20"/>
-              </w:rPr>
-              <w:t xml:space="preserve">3.0x</w:t>
-            </w:r>
-          </w:p>
-        </w:tc>
-        <w:tc>
-          <w:tcPr>
-            <w:tcW w:type="dxa" w:w="1400"/>
-            <w:tcBorders>
-              <w:top w:val="single" w:color="AAAAAA" w:sz="1"/>
-              <w:left w:val="single" w:color="AAAAAA" w:sz="1"/>
-              <w:bottom w:val="single" w:color="AAAAAA" w:sz="1"/>
-              <w:right w:val="single" w:color="AAAAAA" w:sz="1"/>
-            </w:tcBorders>
-            <w:shd w:fill="FFFFFF" w:val="clear"/>
-            <w:tcMar>
-              <w:top w:type="dxa" w:w="80"/>
-              <w:left w:type="dxa" w:w="120"/>
-              <w:bottom w:type="dxa" w:w="80"/>
-              <w:right w:type="dxa" w:w="120"/>
-            </w:tcMar>
-          </w:tcPr>
-          <w:p>
-            <w:pPr>
-              <w:jc w:val="left"/>
-            </w:pPr>
-            <w:r>
-              <w:rPr>
-                <w:rFonts w:ascii="Arial" w:cs="Arial" w:eastAsia="Arial" w:hAnsi="Arial"/>
-                <w:b w:val="false"/>
-                <w:bCs w:val="false"/>
-                <w:color w:val="000000"/>
-                <w:sz w:val="20"/>
-                <w:szCs w:val="20"/>
-              </w:rPr>
-              <w:t xml:space="preserve">1.0x</w:t>
-            </w:r>
-          </w:p>
-        </w:tc>
-        <w:tc>
-          <w:tcPr>
-            <w:tcW w:type="dxa" w:w="1400"/>
-            <w:tcBorders>
-              <w:top w:val="single" w:color="AAAAAA" w:sz="1"/>
-              <w:left w:val="single" w:color="AAAAAA" w:sz="1"/>
-              <w:bottom w:val="single" w:color="AAAAAA" w:sz="1"/>
-              <w:right w:val="single" w:color="AAAAAA" w:sz="1"/>
-            </w:tcBorders>
-            <w:shd w:fill="FFFFFF" w:val="clear"/>
-            <w:tcMar>
-              <w:top w:type="dxa" w:w="80"/>
-              <w:left w:type="dxa" w:w="120"/>
-              <w:bottom w:type="dxa" w:w="80"/>
-              <w:right w:type="dxa" w:w="120"/>
-            </w:tcMar>
-          </w:tcPr>
-          <w:p>
-            <w:pPr>
-              <w:jc w:val="left"/>
-            </w:pPr>
-            <w:r>
-              <w:rPr>
-                <w:rFonts w:ascii="Arial" w:cs="Arial" w:eastAsia="Arial" w:hAnsi="Arial"/>
-                <w:b w:val="false"/>
-                <w:bCs w:val="false"/>
-                <w:color w:val="000000"/>
-                <w:sz w:val="20"/>
-                <w:szCs w:val="20"/>
-              </w:rPr>
-              <w:t xml:space="preserve">5.0x</w:t>
-            </w:r>
-          </w:p>
-        </w:tc>
-      </w:tr>
     </w:tbl>
     <w:p>
       <w:pPr>
@@ -7277,7 +5465,7 @@
           <w:sz w:val="22"/>
           <w:szCs w:val="22"/>
         </w:rPr>
-        <w:t xml:space="preserve">Enters bonus fields: first goalscorer, team that kicked off, yellow cards total, red cards total, minute of first goal (or 'N/A' if 0-0), whether a penalty was awarded, substitutions per team.</w:t>
+        <w:t xml:space="preserve">Confirms the result.</w:t>
       </w:r>
     </w:p>
     <w:p>
@@ -7295,7 +5483,7 @@
           <w:sz w:val="22"/>
           <w:szCs w:val="22"/>
         </w:rPr>
-        <w:t xml:space="preserve">Confirms the result.</w:t>
+        <w:t xml:space="preserve">System automatically calculates and distributes points.</w:t>
       </w:r>
     </w:p>
     <w:p>
@@ -7313,24 +5501,6 @@
           <w:sz w:val="22"/>
           <w:szCs w:val="22"/>
         </w:rPr>
-        <w:t xml:space="preserve">System automatically calculates and distributes points.</w:t>
-      </w:r>
-    </w:p>
-    <w:p>
-      <w:pPr>
-        <w:pStyle w:val="ListParagraph"/>
-        <w:numPr>
-          <w:ilvl w:val="0"/>
-          <w:numId w:val="3"/>
-        </w:numPr>
-        <w:spacing w:after="60" w:before="60"/>
-      </w:pPr>
-      <w:r>
-        <w:rPr>
-          <w:rFonts w:ascii="Arial" w:cs="Arial" w:eastAsia="Arial" w:hAnsi="Arial"/>
-          <w:sz w:val="22"/>
-          <w:szCs w:val="22"/>
-        </w:rPr>
         <w:t xml:space="preserve">Notifications are sent to users.</w:t>
       </w:r>
     </w:p>
@@ -7748,7 +5918,7 @@
           <w:sz w:val="22"/>
           <w:szCs w:val="22"/>
         </w:rPr>
-        <w:t xml:space="preserve">Points are awarded automatically after the official result is confirmed by the Administrator. Base formula:</w:t>
+        <w:t>Points are awarded automatically after the official result is confirmed by the Administrator. Points are given for two outcomes only — an exact score and a correct winner/draw:</w:t>
       </w:r>
     </w:p>
     <w:p>
@@ -8226,838 +6396,6 @@
                 <w:sz w:val="20"/>
                 <w:szCs w:val="20"/>
               </w:rPr>
-              <w:t xml:space="preserve">Exact goal difference bonus</w:t>
-            </w:r>
-          </w:p>
-        </w:tc>
-        <w:tc>
-          <w:tcPr>
-            <w:tcW w:type="dxa" w:w="1400"/>
-            <w:tcBorders>
-              <w:top w:val="single" w:color="AAAAAA" w:sz="1"/>
-              <w:left w:val="single" w:color="AAAAAA" w:sz="1"/>
-              <w:bottom w:val="single" w:color="AAAAAA" w:sz="1"/>
-              <w:right w:val="single" w:color="AAAAAA" w:sz="1"/>
-            </w:tcBorders>
-            <w:shd w:fill="F2F2F2" w:val="clear"/>
-            <w:tcMar>
-              <w:top w:type="dxa" w:w="80"/>
-              <w:left w:type="dxa" w:w="120"/>
-              <w:bottom w:type="dxa" w:w="80"/>
-              <w:right w:type="dxa" w:w="120"/>
-            </w:tcMar>
-          </w:tcPr>
-          <w:p>
-            <w:pPr>
-              <w:jc w:val="left"/>
-            </w:pPr>
-            <w:r>
-              <w:rPr>
-                <w:rFonts w:ascii="Arial" w:cs="Arial" w:eastAsia="Arial" w:hAnsi="Arial"/>
-                <w:b w:val="false"/>
-                <w:bCs w:val="false"/>
-                <w:color w:val="000000"/>
-                <w:sz w:val="20"/>
-                <w:szCs w:val="20"/>
-              </w:rPr>
-              <w:t xml:space="preserve">+1 point</w:t>
-            </w:r>
-          </w:p>
-        </w:tc>
-        <w:tc>
-          <w:tcPr>
-            <w:tcW w:type="dxa" w:w="3360"/>
-            <w:tcBorders>
-              <w:top w:val="single" w:color="AAAAAA" w:sz="1"/>
-              <w:left w:val="single" w:color="AAAAAA" w:sz="1"/>
-              <w:bottom w:val="single" w:color="AAAAAA" w:sz="1"/>
-              <w:right w:val="single" w:color="AAAAAA" w:sz="1"/>
-            </w:tcBorders>
-            <w:shd w:fill="F2F2F2" w:val="clear"/>
-            <w:tcMar>
-              <w:top w:type="dxa" w:w="80"/>
-              <w:left w:type="dxa" w:w="120"/>
-              <w:bottom w:type="dxa" w:w="80"/>
-              <w:right w:type="dxa" w:w="120"/>
-            </w:tcMar>
-          </w:tcPr>
-          <w:p>
-            <w:pPr>
-              <w:jc w:val="left"/>
-            </w:pPr>
-            <w:r>
-              <w:rPr>
-                <w:rFonts w:ascii="Arial" w:cs="Arial" w:eastAsia="Arial" w:hAnsi="Arial"/>
-                <w:b w:val="false"/>
-                <w:bCs w:val="false"/>
-                <w:color w:val="000000"/>
-                <w:sz w:val="20"/>
-                <w:szCs w:val="20"/>
-              </w:rPr>
-              <w:t xml:space="preserve">Predicted 2-0, result 3-1 (diff=+2)</w:t>
-            </w:r>
-          </w:p>
-        </w:tc>
-      </w:tr>
-      <w:tr>
-        <w:tc>
-          <w:tcPr>
-            <w:tcW w:type="dxa" w:w="3200"/>
-            <w:tcBorders>
-              <w:top w:val="single" w:color="AAAAAA" w:sz="1"/>
-              <w:left w:val="single" w:color="AAAAAA" w:sz="1"/>
-              <w:bottom w:val="single" w:color="AAAAAA" w:sz="1"/>
-              <w:right w:val="single" w:color="AAAAAA" w:sz="1"/>
-            </w:tcBorders>
-            <w:shd w:fill="FFFFFF" w:val="clear"/>
-            <w:tcMar>
-              <w:top w:type="dxa" w:w="80"/>
-              <w:left w:type="dxa" w:w="120"/>
-              <w:bottom w:type="dxa" w:w="80"/>
-              <w:right w:type="dxa" w:w="120"/>
-            </w:tcMar>
-          </w:tcPr>
-          <w:p>
-            <w:pPr>
-              <w:jc w:val="left"/>
-            </w:pPr>
-            <w:r>
-              <w:rPr>
-                <w:rFonts w:ascii="Arial" w:cs="Arial" w:eastAsia="Arial" w:hAnsi="Arial"/>
-                <w:b w:val="false"/>
-                <w:bCs w:val="false"/>
-                <w:color w:val="000000"/>
-                <w:sz w:val="20"/>
-                <w:szCs w:val="20"/>
-              </w:rPr>
-              <w:t xml:space="preserve">Correct first goalscorer bonus</w:t>
-            </w:r>
-          </w:p>
-        </w:tc>
-        <w:tc>
-          <w:tcPr>
-            <w:tcW w:type="dxa" w:w="1400"/>
-            <w:tcBorders>
-              <w:top w:val="single" w:color="AAAAAA" w:sz="1"/>
-              <w:left w:val="single" w:color="AAAAAA" w:sz="1"/>
-              <w:bottom w:val="single" w:color="AAAAAA" w:sz="1"/>
-              <w:right w:val="single" w:color="AAAAAA" w:sz="1"/>
-            </w:tcBorders>
-            <w:shd w:fill="FFFFFF" w:val="clear"/>
-            <w:tcMar>
-              <w:top w:type="dxa" w:w="80"/>
-              <w:left w:type="dxa" w:w="120"/>
-              <w:bottom w:type="dxa" w:w="80"/>
-              <w:right w:type="dxa" w:w="120"/>
-            </w:tcMar>
-          </w:tcPr>
-          <w:p>
-            <w:pPr>
-              <w:jc w:val="left"/>
-            </w:pPr>
-            <w:r>
-              <w:rPr>
-                <w:rFonts w:ascii="Arial" w:cs="Arial" w:eastAsia="Arial" w:hAnsi="Arial"/>
-                <w:b w:val="false"/>
-                <w:bCs w:val="false"/>
-                <w:color w:val="000000"/>
-                <w:sz w:val="20"/>
-                <w:szCs w:val="20"/>
-              </w:rPr>
-              <w:t xml:space="preserve">+2 points</w:t>
-            </w:r>
-          </w:p>
-        </w:tc>
-        <w:tc>
-          <w:tcPr>
-            <w:tcW w:type="dxa" w:w="3360"/>
-            <w:tcBorders>
-              <w:top w:val="single" w:color="AAAAAA" w:sz="1"/>
-              <w:left w:val="single" w:color="AAAAAA" w:sz="1"/>
-              <w:bottom w:val="single" w:color="AAAAAA" w:sz="1"/>
-              <w:right w:val="single" w:color="AAAAAA" w:sz="1"/>
-            </w:tcBorders>
-            <w:shd w:fill="FFFFFF" w:val="clear"/>
-            <w:tcMar>
-              <w:top w:type="dxa" w:w="80"/>
-              <w:left w:type="dxa" w:w="120"/>
-              <w:bottom w:type="dxa" w:w="80"/>
-              <w:right w:type="dxa" w:w="120"/>
-            </w:tcMar>
-          </w:tcPr>
-          <w:p>
-            <w:pPr>
-              <w:jc w:val="left"/>
-            </w:pPr>
-            <w:r>
-              <w:rPr>
-                <w:rFonts w:ascii="Arial" w:cs="Arial" w:eastAsia="Arial" w:hAnsi="Arial"/>
-                <w:b w:val="false"/>
-                <w:bCs w:val="false"/>
-                <w:color w:val="000000"/>
-                <w:sz w:val="20"/>
-                <w:szCs w:val="20"/>
-              </w:rPr>
-              <w:t xml:space="preserve">Predicted Mbappe, he scored first</w:t>
-            </w:r>
-          </w:p>
-        </w:tc>
-      </w:tr>
-      <w:tr>
-        <w:tc>
-          <w:tcPr>
-            <w:tcW w:type="dxa" w:w="3200"/>
-            <w:tcBorders>
-              <w:top w:val="single" w:color="AAAAAA" w:sz="1"/>
-              <w:left w:val="single" w:color="AAAAAA" w:sz="1"/>
-              <w:bottom w:val="single" w:color="AAAAAA" w:sz="1"/>
-              <w:right w:val="single" w:color="AAAAAA" w:sz="1"/>
-            </w:tcBorders>
-            <w:shd w:fill="F2F2F2" w:val="clear"/>
-            <w:tcMar>
-              <w:top w:type="dxa" w:w="80"/>
-              <w:left w:type="dxa" w:w="120"/>
-              <w:bottom w:type="dxa" w:w="80"/>
-              <w:right w:type="dxa" w:w="120"/>
-            </w:tcMar>
-          </w:tcPr>
-          <w:p>
-            <w:pPr>
-              <w:jc w:val="left"/>
-            </w:pPr>
-            <w:r>
-              <w:rPr>
-                <w:rFonts w:ascii="Arial" w:cs="Arial" w:eastAsia="Arial" w:hAnsi="Arial"/>
-                <w:b w:val="false"/>
-                <w:bCs w:val="false"/>
-                <w:color w:val="000000"/>
-                <w:sz w:val="20"/>
-                <w:szCs w:val="20"/>
-              </w:rPr>
-              <w:t xml:space="preserve">Correct team to kick off bonus</w:t>
-            </w:r>
-          </w:p>
-        </w:tc>
-        <w:tc>
-          <w:tcPr>
-            <w:tcW w:type="dxa" w:w="1400"/>
-            <w:tcBorders>
-              <w:top w:val="single" w:color="AAAAAA" w:sz="1"/>
-              <w:left w:val="single" w:color="AAAAAA" w:sz="1"/>
-              <w:bottom w:val="single" w:color="AAAAAA" w:sz="1"/>
-              <w:right w:val="single" w:color="AAAAAA" w:sz="1"/>
-            </w:tcBorders>
-            <w:shd w:fill="F2F2F2" w:val="clear"/>
-            <w:tcMar>
-              <w:top w:type="dxa" w:w="80"/>
-              <w:left w:type="dxa" w:w="120"/>
-              <w:bottom w:type="dxa" w:w="80"/>
-              <w:right w:type="dxa" w:w="120"/>
-            </w:tcMar>
-          </w:tcPr>
-          <w:p>
-            <w:pPr>
-              <w:jc w:val="left"/>
-            </w:pPr>
-            <w:r>
-              <w:rPr>
-                <w:rFonts w:ascii="Arial" w:cs="Arial" w:eastAsia="Arial" w:hAnsi="Arial"/>
-                <w:b w:val="false"/>
-                <w:bCs w:val="false"/>
-                <w:color w:val="000000"/>
-                <w:sz w:val="20"/>
-                <w:szCs w:val="20"/>
-              </w:rPr>
-              <w:t xml:space="preserve">+1 point</w:t>
-            </w:r>
-          </w:p>
-        </w:tc>
-        <w:tc>
-          <w:tcPr>
-            <w:tcW w:type="dxa" w:w="3360"/>
-            <w:tcBorders>
-              <w:top w:val="single" w:color="AAAAAA" w:sz="1"/>
-              <w:left w:val="single" w:color="AAAAAA" w:sz="1"/>
-              <w:bottom w:val="single" w:color="AAAAAA" w:sz="1"/>
-              <w:right w:val="single" w:color="AAAAAA" w:sz="1"/>
-            </w:tcBorders>
-            <w:shd w:fill="F2F2F2" w:val="clear"/>
-            <w:tcMar>
-              <w:top w:type="dxa" w:w="80"/>
-              <w:left w:type="dxa" w:w="120"/>
-              <w:bottom w:type="dxa" w:w="80"/>
-              <w:right w:type="dxa" w:w="120"/>
-            </w:tcMar>
-          </w:tcPr>
-          <w:p>
-            <w:pPr>
-              <w:jc w:val="left"/>
-            </w:pPr>
-            <w:r>
-              <w:rPr>
-                <w:rFonts w:ascii="Arial" w:cs="Arial" w:eastAsia="Arial" w:hAnsi="Arial"/>
-                <w:b w:val="false"/>
-                <w:bCs w:val="false"/>
-                <w:color w:val="000000"/>
-                <w:sz w:val="20"/>
-                <w:szCs w:val="20"/>
-              </w:rPr>
-              <w:t xml:space="preserve">Predicted Brazil kicks off, Brazil did</w:t>
-            </w:r>
-          </w:p>
-        </w:tc>
-      </w:tr>
-      <w:tr>
-        <w:tc>
-          <w:tcPr>
-            <w:tcW w:type="dxa" w:w="3200"/>
-            <w:tcBorders>
-              <w:top w:val="single" w:color="AAAAAA" w:sz="1"/>
-              <w:left w:val="single" w:color="AAAAAA" w:sz="1"/>
-              <w:bottom w:val="single" w:color="AAAAAA" w:sz="1"/>
-              <w:right w:val="single" w:color="AAAAAA" w:sz="1"/>
-            </w:tcBorders>
-            <w:shd w:fill="FFFFFF" w:val="clear"/>
-            <w:tcMar>
-              <w:top w:type="dxa" w:w="80"/>
-              <w:left w:type="dxa" w:w="120"/>
-              <w:bottom w:type="dxa" w:w="80"/>
-              <w:right w:type="dxa" w:w="120"/>
-            </w:tcMar>
-          </w:tcPr>
-          <w:p>
-            <w:pPr>
-              <w:jc w:val="left"/>
-            </w:pPr>
-            <w:r>
-              <w:rPr>
-                <w:rFonts w:ascii="Arial" w:cs="Arial" w:eastAsia="Arial" w:hAnsi="Arial"/>
-                <w:b w:val="false"/>
-                <w:bCs w:val="false"/>
-                <w:color w:val="000000"/>
-                <w:sz w:val="20"/>
-                <w:szCs w:val="20"/>
-              </w:rPr>
-              <w:t xml:space="preserve">Correct yellow cards total bonus</w:t>
-            </w:r>
-          </w:p>
-        </w:tc>
-        <w:tc>
-          <w:tcPr>
-            <w:tcW w:type="dxa" w:w="1400"/>
-            <w:tcBorders>
-              <w:top w:val="single" w:color="AAAAAA" w:sz="1"/>
-              <w:left w:val="single" w:color="AAAAAA" w:sz="1"/>
-              <w:bottom w:val="single" w:color="AAAAAA" w:sz="1"/>
-              <w:right w:val="single" w:color="AAAAAA" w:sz="1"/>
-            </w:tcBorders>
-            <w:shd w:fill="FFFFFF" w:val="clear"/>
-            <w:tcMar>
-              <w:top w:type="dxa" w:w="80"/>
-              <w:left w:type="dxa" w:w="120"/>
-              <w:bottom w:type="dxa" w:w="80"/>
-              <w:right w:type="dxa" w:w="120"/>
-            </w:tcMar>
-          </w:tcPr>
-          <w:p>
-            <w:pPr>
-              <w:jc w:val="left"/>
-            </w:pPr>
-            <w:r>
-              <w:rPr>
-                <w:rFonts w:ascii="Arial" w:cs="Arial" w:eastAsia="Arial" w:hAnsi="Arial"/>
-                <w:b w:val="false"/>
-                <w:bCs w:val="false"/>
-                <w:color w:val="000000"/>
-                <w:sz w:val="20"/>
-                <w:szCs w:val="20"/>
-              </w:rPr>
-              <w:t xml:space="preserve">+1 point</w:t>
-            </w:r>
-          </w:p>
-        </w:tc>
-        <w:tc>
-          <w:tcPr>
-            <w:tcW w:type="dxa" w:w="3360"/>
-            <w:tcBorders>
-              <w:top w:val="single" w:color="AAAAAA" w:sz="1"/>
-              <w:left w:val="single" w:color="AAAAAA" w:sz="1"/>
-              <w:bottom w:val="single" w:color="AAAAAA" w:sz="1"/>
-              <w:right w:val="single" w:color="AAAAAA" w:sz="1"/>
-            </w:tcBorders>
-            <w:shd w:fill="FFFFFF" w:val="clear"/>
-            <w:tcMar>
-              <w:top w:type="dxa" w:w="80"/>
-              <w:left w:type="dxa" w:w="120"/>
-              <w:bottom w:type="dxa" w:w="80"/>
-              <w:right w:type="dxa" w:w="120"/>
-            </w:tcMar>
-          </w:tcPr>
-          <w:p>
-            <w:pPr>
-              <w:jc w:val="left"/>
-            </w:pPr>
-            <w:r>
-              <w:rPr>
-                <w:rFonts w:ascii="Arial" w:cs="Arial" w:eastAsia="Arial" w:hAnsi="Arial"/>
-                <w:b w:val="false"/>
-                <w:bCs w:val="false"/>
-                <w:color w:val="000000"/>
-                <w:sz w:val="20"/>
-                <w:szCs w:val="20"/>
-              </w:rPr>
-              <w:t xml:space="preserve">Predicted 2 yellow cards, 2 shown</w:t>
-            </w:r>
-          </w:p>
-        </w:tc>
-      </w:tr>
-      <w:tr>
-        <w:tc>
-          <w:tcPr>
-            <w:tcW w:type="dxa" w:w="3200"/>
-            <w:tcBorders>
-              <w:top w:val="single" w:color="AAAAAA" w:sz="1"/>
-              <w:left w:val="single" w:color="AAAAAA" w:sz="1"/>
-              <w:bottom w:val="single" w:color="AAAAAA" w:sz="1"/>
-              <w:right w:val="single" w:color="AAAAAA" w:sz="1"/>
-            </w:tcBorders>
-            <w:shd w:fill="F2F2F2" w:val="clear"/>
-            <w:tcMar>
-              <w:top w:type="dxa" w:w="80"/>
-              <w:left w:type="dxa" w:w="120"/>
-              <w:bottom w:type="dxa" w:w="80"/>
-              <w:right w:type="dxa" w:w="120"/>
-            </w:tcMar>
-          </w:tcPr>
-          <w:p>
-            <w:pPr>
-              <w:jc w:val="left"/>
-            </w:pPr>
-            <w:r>
-              <w:rPr>
-                <w:rFonts w:ascii="Arial" w:cs="Arial" w:eastAsia="Arial" w:hAnsi="Arial"/>
-                <w:b w:val="false"/>
-                <w:bCs w:val="false"/>
-                <w:color w:val="000000"/>
-                <w:sz w:val="20"/>
-                <w:szCs w:val="20"/>
-              </w:rPr>
-              <w:t xml:space="preserve">Correct red cards total bonus</w:t>
-            </w:r>
-          </w:p>
-        </w:tc>
-        <w:tc>
-          <w:tcPr>
-            <w:tcW w:type="dxa" w:w="1400"/>
-            <w:tcBorders>
-              <w:top w:val="single" w:color="AAAAAA" w:sz="1"/>
-              <w:left w:val="single" w:color="AAAAAA" w:sz="1"/>
-              <w:bottom w:val="single" w:color="AAAAAA" w:sz="1"/>
-              <w:right w:val="single" w:color="AAAAAA" w:sz="1"/>
-            </w:tcBorders>
-            <w:shd w:fill="F2F2F2" w:val="clear"/>
-            <w:tcMar>
-              <w:top w:type="dxa" w:w="80"/>
-              <w:left w:type="dxa" w:w="120"/>
-              <w:bottom w:type="dxa" w:w="80"/>
-              <w:right w:type="dxa" w:w="120"/>
-            </w:tcMar>
-          </w:tcPr>
-          <w:p>
-            <w:pPr>
-              <w:jc w:val="left"/>
-            </w:pPr>
-            <w:r>
-              <w:rPr>
-                <w:rFonts w:ascii="Arial" w:cs="Arial" w:eastAsia="Arial" w:hAnsi="Arial"/>
-                <w:b w:val="false"/>
-                <w:bCs w:val="false"/>
-                <w:color w:val="000000"/>
-                <w:sz w:val="20"/>
-                <w:szCs w:val="20"/>
-              </w:rPr>
-              <w:t xml:space="preserve">+1 point</w:t>
-            </w:r>
-          </w:p>
-        </w:tc>
-        <w:tc>
-          <w:tcPr>
-            <w:tcW w:type="dxa" w:w="3360"/>
-            <w:tcBorders>
-              <w:top w:val="single" w:color="AAAAAA" w:sz="1"/>
-              <w:left w:val="single" w:color="AAAAAA" w:sz="1"/>
-              <w:bottom w:val="single" w:color="AAAAAA" w:sz="1"/>
-              <w:right w:val="single" w:color="AAAAAA" w:sz="1"/>
-            </w:tcBorders>
-            <w:shd w:fill="F2F2F2" w:val="clear"/>
-            <w:tcMar>
-              <w:top w:type="dxa" w:w="80"/>
-              <w:left w:type="dxa" w:w="120"/>
-              <w:bottom w:type="dxa" w:w="80"/>
-              <w:right w:type="dxa" w:w="120"/>
-            </w:tcMar>
-          </w:tcPr>
-          <w:p>
-            <w:pPr>
-              <w:jc w:val="left"/>
-            </w:pPr>
-            <w:r>
-              <w:rPr>
-                <w:rFonts w:ascii="Arial" w:cs="Arial" w:eastAsia="Arial" w:hAnsi="Arial"/>
-                <w:b w:val="false"/>
-                <w:bCs w:val="false"/>
-                <w:color w:val="000000"/>
-                <w:sz w:val="20"/>
-                <w:szCs w:val="20"/>
-              </w:rPr>
-              <w:t xml:space="preserve">Predicted 1 red card, 1 shown</w:t>
-            </w:r>
-          </w:p>
-        </w:tc>
-      </w:tr>
-      <w:tr>
-        <w:tc>
-          <w:tcPr>
-            <w:tcW w:type="dxa" w:w="3200"/>
-            <w:tcBorders>
-              <w:top w:val="single" w:color="AAAAAA" w:sz="1"/>
-              <w:left w:val="single" w:color="AAAAAA" w:sz="1"/>
-              <w:bottom w:val="single" w:color="AAAAAA" w:sz="1"/>
-              <w:right w:val="single" w:color="AAAAAA" w:sz="1"/>
-            </w:tcBorders>
-            <w:shd w:fill="FFFFFF" w:val="clear"/>
-            <w:tcMar>
-              <w:top w:type="dxa" w:w="80"/>
-              <w:left w:type="dxa" w:w="120"/>
-              <w:bottom w:type="dxa" w:w="80"/>
-              <w:right w:type="dxa" w:w="120"/>
-            </w:tcMar>
-          </w:tcPr>
-          <w:p>
-            <w:pPr>
-              <w:jc w:val="left"/>
-            </w:pPr>
-            <w:r>
-              <w:rPr>
-                <w:rFonts w:ascii="Arial" w:cs="Arial" w:eastAsia="Arial" w:hAnsi="Arial"/>
-                <w:b w:val="false"/>
-                <w:bCs w:val="false"/>
-                <w:color w:val="000000"/>
-                <w:sz w:val="20"/>
-                <w:szCs w:val="20"/>
-              </w:rPr>
-              <w:t xml:space="preserve">Correct minute of first goal (±5 min)</w:t>
-            </w:r>
-          </w:p>
-        </w:tc>
-        <w:tc>
-          <w:tcPr>
-            <w:tcW w:type="dxa" w:w="1400"/>
-            <w:tcBorders>
-              <w:top w:val="single" w:color="AAAAAA" w:sz="1"/>
-              <w:left w:val="single" w:color="AAAAAA" w:sz="1"/>
-              <w:bottom w:val="single" w:color="AAAAAA" w:sz="1"/>
-              <w:right w:val="single" w:color="AAAAAA" w:sz="1"/>
-            </w:tcBorders>
-            <w:shd w:fill="FFFFFF" w:val="clear"/>
-            <w:tcMar>
-              <w:top w:type="dxa" w:w="80"/>
-              <w:left w:type="dxa" w:w="120"/>
-              <w:bottom w:type="dxa" w:w="80"/>
-              <w:right w:type="dxa" w:w="120"/>
-            </w:tcMar>
-          </w:tcPr>
-          <w:p>
-            <w:pPr>
-              <w:jc w:val="left"/>
-            </w:pPr>
-            <w:r>
-              <w:rPr>
-                <w:rFonts w:ascii="Arial" w:cs="Arial" w:eastAsia="Arial" w:hAnsi="Arial"/>
-                <w:b w:val="false"/>
-                <w:bCs w:val="false"/>
-                <w:color w:val="000000"/>
-                <w:sz w:val="20"/>
-                <w:szCs w:val="20"/>
-              </w:rPr>
-              <w:t xml:space="preserve">+2 points</w:t>
-            </w:r>
-          </w:p>
-        </w:tc>
-        <w:tc>
-          <w:tcPr>
-            <w:tcW w:type="dxa" w:w="3360"/>
-            <w:tcBorders>
-              <w:top w:val="single" w:color="AAAAAA" w:sz="1"/>
-              <w:left w:val="single" w:color="AAAAAA" w:sz="1"/>
-              <w:bottom w:val="single" w:color="AAAAAA" w:sz="1"/>
-              <w:right w:val="single" w:color="AAAAAA" w:sz="1"/>
-            </w:tcBorders>
-            <w:shd w:fill="FFFFFF" w:val="clear"/>
-            <w:tcMar>
-              <w:top w:type="dxa" w:w="80"/>
-              <w:left w:type="dxa" w:w="120"/>
-              <w:bottom w:type="dxa" w:w="80"/>
-              <w:right w:type="dxa" w:w="120"/>
-            </w:tcMar>
-          </w:tcPr>
-          <w:p>
-            <w:pPr>
-              <w:jc w:val="left"/>
-            </w:pPr>
-            <w:r>
-              <w:rPr>
-                <w:rFonts w:ascii="Arial" w:cs="Arial" w:eastAsia="Arial" w:hAnsi="Arial"/>
-                <w:b w:val="false"/>
-                <w:bCs w:val="false"/>
-                <w:color w:val="000000"/>
-                <w:sz w:val="20"/>
-                <w:szCs w:val="20"/>
-              </w:rPr>
-              <w:t xml:space="preserve">Predicted min 23, first goal at min 25</w:t>
-            </w:r>
-          </w:p>
-        </w:tc>
-      </w:tr>
-      <w:tr>
-        <w:tc>
-          <w:tcPr>
-            <w:tcW w:type="dxa" w:w="3200"/>
-            <w:tcBorders>
-              <w:top w:val="single" w:color="AAAAAA" w:sz="1"/>
-              <w:left w:val="single" w:color="AAAAAA" w:sz="1"/>
-              <w:bottom w:val="single" w:color="AAAAAA" w:sz="1"/>
-              <w:right w:val="single" w:color="AAAAAA" w:sz="1"/>
-            </w:tcBorders>
-            <w:shd w:fill="F2F2F2" w:val="clear"/>
-            <w:tcMar>
-              <w:top w:type="dxa" w:w="80"/>
-              <w:left w:type="dxa" w:w="120"/>
-              <w:bottom w:type="dxa" w:w="80"/>
-              <w:right w:type="dxa" w:w="120"/>
-            </w:tcMar>
-          </w:tcPr>
-          <w:p>
-            <w:pPr>
-              <w:jc w:val="left"/>
-            </w:pPr>
-            <w:r>
-              <w:rPr>
-                <w:rFonts w:ascii="Arial" w:cs="Arial" w:eastAsia="Arial" w:hAnsi="Arial"/>
-                <w:b w:val="false"/>
-                <w:bCs w:val="false"/>
-                <w:color w:val="000000"/>
-                <w:sz w:val="20"/>
-                <w:szCs w:val="20"/>
-              </w:rPr>
-              <w:t xml:space="preserve">Correct penalty prediction (yes/no)</w:t>
-            </w:r>
-          </w:p>
-        </w:tc>
-        <w:tc>
-          <w:tcPr>
-            <w:tcW w:type="dxa" w:w="1400"/>
-            <w:tcBorders>
-              <w:top w:val="single" w:color="AAAAAA" w:sz="1"/>
-              <w:left w:val="single" w:color="AAAAAA" w:sz="1"/>
-              <w:bottom w:val="single" w:color="AAAAAA" w:sz="1"/>
-              <w:right w:val="single" w:color="AAAAAA" w:sz="1"/>
-            </w:tcBorders>
-            <w:shd w:fill="F2F2F2" w:val="clear"/>
-            <w:tcMar>
-              <w:top w:type="dxa" w:w="80"/>
-              <w:left w:type="dxa" w:w="120"/>
-              <w:bottom w:type="dxa" w:w="80"/>
-              <w:right w:type="dxa" w:w="120"/>
-            </w:tcMar>
-          </w:tcPr>
-          <w:p>
-            <w:pPr>
-              <w:jc w:val="left"/>
-            </w:pPr>
-            <w:r>
-              <w:rPr>
-                <w:rFonts w:ascii="Arial" w:cs="Arial" w:eastAsia="Arial" w:hAnsi="Arial"/>
-                <w:b w:val="false"/>
-                <w:bCs w:val="false"/>
-                <w:color w:val="000000"/>
-                <w:sz w:val="20"/>
-                <w:szCs w:val="20"/>
-              </w:rPr>
-              <w:t xml:space="preserve">+1 point</w:t>
-            </w:r>
-          </w:p>
-        </w:tc>
-        <w:tc>
-          <w:tcPr>
-            <w:tcW w:type="dxa" w:w="3360"/>
-            <w:tcBorders>
-              <w:top w:val="single" w:color="AAAAAA" w:sz="1"/>
-              <w:left w:val="single" w:color="AAAAAA" w:sz="1"/>
-              <w:bottom w:val="single" w:color="AAAAAA" w:sz="1"/>
-              <w:right w:val="single" w:color="AAAAAA" w:sz="1"/>
-            </w:tcBorders>
-            <w:shd w:fill="F2F2F2" w:val="clear"/>
-            <w:tcMar>
-              <w:top w:type="dxa" w:w="80"/>
-              <w:left w:type="dxa" w:w="120"/>
-              <w:bottom w:type="dxa" w:w="80"/>
-              <w:right w:type="dxa" w:w="120"/>
-            </w:tcMar>
-          </w:tcPr>
-          <w:p>
-            <w:pPr>
-              <w:jc w:val="left"/>
-            </w:pPr>
-            <w:r>
-              <w:rPr>
-                <w:rFonts w:ascii="Arial" w:cs="Arial" w:eastAsia="Arial" w:hAnsi="Arial"/>
-                <w:b w:val="false"/>
-                <w:bCs w:val="false"/>
-                <w:color w:val="000000"/>
-                <w:sz w:val="20"/>
-                <w:szCs w:val="20"/>
-              </w:rPr>
-              <w:t xml:space="preserve">Predicted a penalty, one was awarded</w:t>
-            </w:r>
-          </w:p>
-        </w:tc>
-      </w:tr>
-      <w:tr>
-        <w:tc>
-          <w:tcPr>
-            <w:tcW w:type="dxa" w:w="3200"/>
-            <w:tcBorders>
-              <w:top w:val="single" w:color="AAAAAA" w:sz="1"/>
-              <w:left w:val="single" w:color="AAAAAA" w:sz="1"/>
-              <w:bottom w:val="single" w:color="AAAAAA" w:sz="1"/>
-              <w:right w:val="single" w:color="AAAAAA" w:sz="1"/>
-            </w:tcBorders>
-            <w:shd w:fill="FFFFFF" w:val="clear"/>
-            <w:tcMar>
-              <w:top w:type="dxa" w:w="80"/>
-              <w:left w:type="dxa" w:w="120"/>
-              <w:bottom w:type="dxa" w:w="80"/>
-              <w:right w:type="dxa" w:w="120"/>
-            </w:tcMar>
-          </w:tcPr>
-          <w:p>
-            <w:pPr>
-              <w:jc w:val="left"/>
-            </w:pPr>
-            <w:r>
-              <w:rPr>
-                <w:rFonts w:ascii="Arial" w:cs="Arial" w:eastAsia="Arial" w:hAnsi="Arial"/>
-                <w:b w:val="false"/>
-                <w:bCs w:val="false"/>
-                <w:color w:val="000000"/>
-                <w:sz w:val="20"/>
-                <w:szCs w:val="20"/>
-              </w:rPr>
-              <w:t xml:space="preserve">Correct substitutions per team bonus</w:t>
-            </w:r>
-          </w:p>
-        </w:tc>
-        <w:tc>
-          <w:tcPr>
-            <w:tcW w:type="dxa" w:w="1400"/>
-            <w:tcBorders>
-              <w:top w:val="single" w:color="AAAAAA" w:sz="1"/>
-              <w:left w:val="single" w:color="AAAAAA" w:sz="1"/>
-              <w:bottom w:val="single" w:color="AAAAAA" w:sz="1"/>
-              <w:right w:val="single" w:color="AAAAAA" w:sz="1"/>
-            </w:tcBorders>
-            <w:shd w:fill="FFFFFF" w:val="clear"/>
-            <w:tcMar>
-              <w:top w:type="dxa" w:w="80"/>
-              <w:left w:type="dxa" w:w="120"/>
-              <w:bottom w:type="dxa" w:w="80"/>
-              <w:right w:type="dxa" w:w="120"/>
-            </w:tcMar>
-          </w:tcPr>
-          <w:p>
-            <w:pPr>
-              <w:jc w:val="left"/>
-            </w:pPr>
-            <w:r>
-              <w:rPr>
-                <w:rFonts w:ascii="Arial" w:cs="Arial" w:eastAsia="Arial" w:hAnsi="Arial"/>
-                <w:b w:val="false"/>
-                <w:bCs w:val="false"/>
-                <w:color w:val="000000"/>
-                <w:sz w:val="20"/>
-                <w:szCs w:val="20"/>
-              </w:rPr>
-              <w:t xml:space="preserve">+1 point</w:t>
-            </w:r>
-          </w:p>
-        </w:tc>
-        <w:tc>
-          <w:tcPr>
-            <w:tcW w:type="dxa" w:w="3360"/>
-            <w:tcBorders>
-              <w:top w:val="single" w:color="AAAAAA" w:sz="1"/>
-              <w:left w:val="single" w:color="AAAAAA" w:sz="1"/>
-              <w:bottom w:val="single" w:color="AAAAAA" w:sz="1"/>
-              <w:right w:val="single" w:color="AAAAAA" w:sz="1"/>
-            </w:tcBorders>
-            <w:shd w:fill="FFFFFF" w:val="clear"/>
-            <w:tcMar>
-              <w:top w:type="dxa" w:w="80"/>
-              <w:left w:type="dxa" w:w="120"/>
-              <w:bottom w:type="dxa" w:w="80"/>
-              <w:right w:type="dxa" w:w="120"/>
-            </w:tcMar>
-          </w:tcPr>
-          <w:p>
-            <w:pPr>
-              <w:jc w:val="left"/>
-            </w:pPr>
-            <w:r>
-              <w:rPr>
-                <w:rFonts w:ascii="Arial" w:cs="Arial" w:eastAsia="Arial" w:hAnsi="Arial"/>
-                <w:b w:val="false"/>
-                <w:bCs w:val="false"/>
-                <w:color w:val="000000"/>
-                <w:sz w:val="20"/>
-                <w:szCs w:val="20"/>
-              </w:rPr>
-              <w:t xml:space="preserve">Predicted 3 subs per team, 3 made</w:t>
-            </w:r>
-          </w:p>
-        </w:tc>
-      </w:tr>
-      <w:tr>
-        <w:tc>
-          <w:tcPr>
-            <w:tcW w:type="dxa" w:w="3200"/>
-            <w:tcBorders>
-              <w:top w:val="single" w:color="AAAAAA" w:sz="1"/>
-              <w:left w:val="single" w:color="AAAAAA" w:sz="1"/>
-              <w:bottom w:val="single" w:color="AAAAAA" w:sz="1"/>
-              <w:right w:val="single" w:color="AAAAAA" w:sz="1"/>
-            </w:tcBorders>
-            <w:shd w:fill="F2F2F2" w:val="clear"/>
-            <w:tcMar>
-              <w:top w:type="dxa" w:w="80"/>
-              <w:left w:type="dxa" w:w="120"/>
-              <w:bottom w:type="dxa" w:w="80"/>
-              <w:right w:type="dxa" w:w="120"/>
-            </w:tcMar>
-          </w:tcPr>
-          <w:p>
-            <w:pPr>
-              <w:jc w:val="left"/>
-            </w:pPr>
-            <w:r>
-              <w:rPr>
-                <w:rFonts w:ascii="Arial" w:cs="Arial" w:eastAsia="Arial" w:hAnsi="Arial"/>
-                <w:b w:val="false"/>
-                <w:bCs w:val="false"/>
-                <w:color w:val="000000"/>
-                <w:sz w:val="20"/>
-                <w:szCs w:val="20"/>
-              </w:rPr>
               <w:t xml:space="preserve">Completely wrong prediction</w:t>
             </w:r>
           </w:p>
@@ -9138,19 +6476,6 @@
       </w:pPr>
       <w:r>
         <w:t xml:space="preserve"/>
-      </w:r>
-    </w:p>
-    <w:p>
-      <w:pPr>
-        <w:spacing w:after="80" w:before="80"/>
-      </w:pPr>
-      <w:r>
-        <w:rPr>
-          <w:rFonts w:ascii="Arial" w:cs="Arial" w:eastAsia="Arial" w:hAnsi="Arial"/>
-          <w:sz w:val="22"/>
-          <w:szCs w:val="22"/>
-        </w:rPr>
-        <w:t xml:space="preserve">BR-001: The stage multiplier is applied to the total match points (not to individual bonuses).</w:t>
       </w:r>
     </w:p>
     <w:p>
@@ -9507,146 +6832,6 @@
       </w:pPr>
       <w:r>
         <w:t xml:space="preserve"/>
-      </w:r>
-    </w:p>
-    <w:p>
-      <w:pPr>
-        <w:pStyle w:val="Heading2"/>
-        <w:spacing w:after="140" w:before="280"/>
-      </w:pPr>
-      <w:r>
-        <w:rPr>
-          <w:rFonts w:ascii="Arial" w:cs="Arial" w:eastAsia="Arial" w:hAnsi="Arial"/>
-          <w:b/>
-          <w:bCs/>
-          <w:color w:val="2E75B6"/>
-          <w:sz w:val="28"/>
-          <w:szCs w:val="28"/>
-        </w:rPr>
-        <w:t xml:space="preserve">6.5 Bonus Prediction Rules</w:t>
-      </w:r>
-    </w:p>
-    <w:p>
-      <w:pPr>
-        <w:spacing w:after="80" w:before="80"/>
-      </w:pPr>
-      <w:r>
-        <w:rPr>
-          <w:rFonts w:ascii="Arial" w:cs="Arial" w:eastAsia="Arial" w:hAnsi="Arial"/>
-          <w:sz w:val="22"/>
-          <w:szCs w:val="22"/>
-        </w:rPr>
-        <w:t xml:space="preserve">BR-023: Team to Kick Off — The user predicts which team will kick off the match. Points are awarded only if the correct team is selected. The kick-off team is confirmed by the Admin when entering the official result. This bonus is enabled/disabled and configurable by the Admin (default: enabled, +1 point).</w:t>
-      </w:r>
-    </w:p>
-    <w:p>
-      <w:pPr>
-        <w:spacing w:after="60" w:before="60"/>
-      </w:pPr>
-      <w:r>
-        <w:t xml:space="preserve"/>
-      </w:r>
-    </w:p>
-    <w:p>
-      <w:pPr>
-        <w:spacing w:after="80" w:before="80"/>
-      </w:pPr>
-      <w:r>
-        <w:rPr>
-          <w:rFonts w:ascii="Arial" w:cs="Arial" w:eastAsia="Arial" w:hAnsi="Arial"/>
-          <w:sz w:val="22"/>
-          <w:szCs w:val="22"/>
-        </w:rPr>
-        <w:t xml:space="preserve">BR-024: Yellow Cards Total — The user predicts the total number of yellow cards shown during the match (both teams combined). Points are awarded only for an exact match. The valid range for input is 0–20 cards. This bonus is enabled/disabled and configurable by the Admin (default: enabled, +1 point).</w:t>
-      </w:r>
-    </w:p>
-    <w:p>
-      <w:pPr>
-        <w:spacing w:after="60" w:before="60"/>
-      </w:pPr>
-      <w:r>
-        <w:t xml:space="preserve"/>
-      </w:r>
-    </w:p>
-    <w:p>
-      <w:pPr>
-        <w:spacing w:after="80" w:before="80"/>
-      </w:pPr>
-      <w:r>
-        <w:rPr>
-          <w:rFonts w:ascii="Arial" w:cs="Arial" w:eastAsia="Arial" w:hAnsi="Arial"/>
-          <w:sz w:val="22"/>
-          <w:szCs w:val="22"/>
-        </w:rPr>
-        <w:t xml:space="preserve">BR-025: Red Cards Total — The user predicts the total number of red cards shown during the match (both teams combined). Points are awarded only for an exact match. The valid range for input is 0–10 cards. If a second yellow results in a red, it counts as a red card only. This bonus is enabled/disabled and configurable by the Admin (default: enabled, +1 point).</w:t>
-      </w:r>
-    </w:p>
-    <w:p>
-      <w:pPr>
-        <w:spacing w:after="60" w:before="60"/>
-      </w:pPr>
-      <w:r>
-        <w:t xml:space="preserve"/>
-      </w:r>
-    </w:p>
-    <w:p>
-      <w:pPr>
-        <w:spacing w:after="80" w:before="80"/>
-      </w:pPr>
-      <w:r>
-        <w:rPr>
-          <w:rFonts w:ascii="Arial" w:cs="Arial" w:eastAsia="Arial" w:hAnsi="Arial"/>
-          <w:sz w:val="22"/>
-          <w:szCs w:val="22"/>
-        </w:rPr>
-        <w:t xml:space="preserve">BR-026: Minute of First Goal — The user predicts the minute in which the first goal of the match is scored. Points are awarded if the actual minute falls within a ±5 minute tolerance window of the prediction (e.g. predict minute 30, goal at minute 33 = correct). If the match ends 0-0, all predictions for this field are marked 'Void' — no points, no penalty. The tolerance window is configurable by the Admin (default: ±5 min). This bonus is enabled/disabled and configurable by the Admin (default: enabled, +2 points).</w:t>
-      </w:r>
-    </w:p>
-    <w:p>
-      <w:pPr>
-        <w:spacing w:after="60" w:before="60"/>
-      </w:pPr>
-      <w:r>
-        <w:t xml:space="preserve"/>
-      </w:r>
-    </w:p>
-    <w:p>
-      <w:pPr>
-        <w:spacing w:after="80" w:before="80"/>
-      </w:pPr>
-      <w:r>
-        <w:rPr>
-          <w:rFonts w:ascii="Arial" w:cs="Arial" w:eastAsia="Arial" w:hAnsi="Arial"/>
-          <w:sz w:val="22"/>
-          <w:szCs w:val="22"/>
-        </w:rPr>
-        <w:t xml:space="preserve">BR-027: Penalty During Match (Yes/No) — The user predicts whether at least one penalty kick will be awarded during the match (excluding penalty shootouts). Points are awarded for a correct yes/no answer. Penalty shootouts at the end of a knockout match do not count for this prediction. This bonus is enabled/disabled and configurable by the Admin (default: enabled, +1 point).</w:t>
-      </w:r>
-    </w:p>
-    <w:p>
-      <w:pPr>
-        <w:spacing w:after="60" w:before="60"/>
-      </w:pPr>
-      <w:r>
-        <w:t xml:space="preserve"/>
-      </w:r>
-    </w:p>
-    <w:p>
-      <w:pPr>
-        <w:spacing w:after="80" w:before="80"/>
-      </w:pPr>
-      <w:r>
-        <w:rPr>
-          <w:rFonts w:ascii="Arial" w:cs="Arial" w:eastAsia="Arial" w:hAnsi="Arial"/>
-          <w:sz w:val="22"/>
-          <w:szCs w:val="22"/>
-        </w:rPr>
-        <w:t xml:space="preserve">BR-028: Substitutions Per Team — The user predicts the number of substitutions each team will make. Points are awarded only if both teams' substitution counts are exactly correct. The valid range for input is 0–5 substitutions per team (max 5 allowed per team under FIFA rules). This bonus is enabled/disabled and configurable by the Admin (default: enabled, +1 point).</w:t>
-      </w:r>
-    </w:p>
-    <w:p>
-      <w:r>
-        <w:br w:type="page"/>
       </w:r>
     </w:p>
     <w:p>

</xml_diff>